<commit_message>
Initial commit: dataset and project setup
</commit_message>
<xml_diff>
--- a/DRAFT.docx
+++ b/DRAFT.docx
@@ -1573,6 +1573,1353 @@
         <w:t>and negative correlation between social support and depression (r=-0.65).</w:t>
       </w:r>
     </w:p>
+    <w:p>
+      <w:pPr>
+        <w:rPr>
+          <w:b/>
+          <w:bCs/>
+        </w:rPr>
+      </w:pPr>
+      <w:r>
+        <w:rPr>
+          <w:b/>
+          <w:bCs/>
+        </w:rPr>
+        <w:t>DAY 1–2 → Write: Introduction + Data Description</w:t>
+      </w:r>
+    </w:p>
+    <w:p>
+      <w:r>
+        <w:t>You can copy, edit, and personalize this.</w:t>
+      </w:r>
+    </w:p>
+    <w:p>
+      <w:pPr>
+        <w:rPr>
+          <w:b/>
+          <w:bCs/>
+        </w:rPr>
+      </w:pPr>
+      <w:r>
+        <w:rPr>
+          <w:b/>
+          <w:bCs/>
+        </w:rPr>
+        <w:t>TITLE (suggestion)</w:t>
+      </w:r>
+    </w:p>
+    <w:p>
+      <w:r>
+        <w:rPr>
+          <w:b/>
+          <w:bCs/>
+        </w:rPr>
+        <w:t>Predicting Mental Health Treatment-Seeking Behaviour Using Lifestyle and Psychological Indicators</w:t>
+      </w:r>
+    </w:p>
+    <w:p>
+      <w:r>
+        <w:lastRenderedPageBreak/>
+        <w:pict w14:anchorId="2D615208">
+          <v:rect id="_x0000_i1076" style="width:0;height:1.5pt" o:hralign="center" o:hrstd="t" o:hr="t" fillcolor="#a0a0a0" stroked="f"/>
+        </w:pict>
+      </w:r>
+    </w:p>
+    <w:p>
+      <w:pPr>
+        <w:rPr>
+          <w:b/>
+          <w:bCs/>
+        </w:rPr>
+      </w:pPr>
+      <w:r>
+        <w:rPr>
+          <w:b/>
+          <w:bCs/>
+        </w:rPr>
+        <w:t>SECTION 1 — INTRODUCTION (≈ ½ page)</w:t>
+      </w:r>
+    </w:p>
+    <w:p>
+      <w:r>
+        <w:rPr>
+          <w:i/>
+          <w:iCs/>
+        </w:rPr>
+        <w:t>(You can paste something very close to this and tweak it)</w:t>
+      </w:r>
+    </w:p>
+    <w:p>
+      <w:r>
+        <w:t>Mental health is increasingly recognized as a critical component of overall well-being, yet many individuals do not seek professional help when experiencing psychological distress. Understanding the factors that influence treatment-seeking behaviour is therefore important for improving access to mental health support and designing effective public health interventions.</w:t>
+      </w:r>
+    </w:p>
+    <w:p>
+      <w:r>
+        <w:t>This study aims to develop a predictive model that identifies whether an individual is likely to seek mental health treatment based on demographic, lifestyle, and psychological factors. By applying machine learning techniques to a real-world dataset, this report explores relationships between variables such as stress level, sleep patterns, physical activity, depression, anxiety, and social support, and their influence on treatment-seeking decisions.</w:t>
+      </w:r>
+    </w:p>
+    <w:p>
+      <w:r>
+        <w:t>The findings of this study can contribute to better understanding of mental health behaviour patterns and may support healthcare professionals and policymakers in identifying individuals who may benefit from targeted mental health resources.</w:t>
+      </w:r>
+    </w:p>
+    <w:p>
+      <w:r>
+        <w:pict w14:anchorId="0994CD9C">
+          <v:rect id="_x0000_i1077" style="width:0;height:1.5pt" o:hralign="center" o:hrstd="t" o:hr="t" fillcolor="#a0a0a0" stroked="f"/>
+        </w:pict>
+      </w:r>
+    </w:p>
+    <w:p>
+      <w:pPr>
+        <w:rPr>
+          <w:b/>
+          <w:bCs/>
+        </w:rPr>
+      </w:pPr>
+      <w:r>
+        <w:rPr>
+          <w:b/>
+          <w:bCs/>
+        </w:rPr>
+        <w:t>SECTION 2 — DATA DESCRIPTION (≈ ¾ page)</w:t>
+      </w:r>
+    </w:p>
+    <w:p>
+      <w:r>
+        <w:t xml:space="preserve">The dataset used in this study is the </w:t>
+      </w:r>
+      <w:r>
+        <w:rPr>
+          <w:i/>
+          <w:iCs/>
+        </w:rPr>
+        <w:t>Sleep Health and Lifestyle Dataset</w:t>
+      </w:r>
+      <w:r>
+        <w:t xml:space="preserve"> obtained from Kaggle. It contains information related to individuals’ mental health, lifestyle habits, and productivity. The dataset includes both numerical and categorical variables.</w:t>
+      </w:r>
+    </w:p>
+    <w:p>
+      <w:r>
+        <w:t>Key variables in the dataset include:</w:t>
+      </w:r>
+    </w:p>
+    <w:p>
+      <w:pPr>
+        <w:numPr>
+          <w:ilvl w:val="0"/>
+          <w:numId w:val="7"/>
+        </w:numPr>
+      </w:pPr>
+      <w:r>
+        <w:rPr>
+          <w:b/>
+          <w:bCs/>
+        </w:rPr>
+        <w:t>Demographic factors:</w:t>
+      </w:r>
+      <w:r>
+        <w:t xml:space="preserve"> age, gender, employment status, and work environment.</w:t>
+      </w:r>
+    </w:p>
+    <w:p>
+      <w:pPr>
+        <w:numPr>
+          <w:ilvl w:val="0"/>
+          <w:numId w:val="7"/>
+        </w:numPr>
+      </w:pPr>
+      <w:r>
+        <w:rPr>
+          <w:b/>
+          <w:bCs/>
+        </w:rPr>
+        <w:t>Mental health indicators:</w:t>
+      </w:r>
+      <w:r>
+        <w:t xml:space="preserve"> stress level, depression score, anxiety score, and mental health history.</w:t>
+      </w:r>
+    </w:p>
+    <w:p>
+      <w:pPr>
+        <w:numPr>
+          <w:ilvl w:val="0"/>
+          <w:numId w:val="7"/>
+        </w:numPr>
+      </w:pPr>
+      <w:r>
+        <w:rPr>
+          <w:b/>
+          <w:bCs/>
+        </w:rPr>
+        <w:t>Lifestyle factors:</w:t>
+      </w:r>
+      <w:r>
+        <w:t xml:space="preserve"> sleep hours, physical activity days, and social support score.</w:t>
+      </w:r>
+    </w:p>
+    <w:p>
+      <w:pPr>
+        <w:numPr>
+          <w:ilvl w:val="0"/>
+          <w:numId w:val="7"/>
+        </w:numPr>
+      </w:pPr>
+      <w:r>
+        <w:rPr>
+          <w:b/>
+          <w:bCs/>
+        </w:rPr>
+        <w:t>Outcome variable:</w:t>
+      </w:r>
+      <w:r>
+        <w:t xml:space="preserve"> </w:t>
+      </w:r>
+      <w:r>
+        <w:rPr>
+          <w:i/>
+          <w:iCs/>
+        </w:rPr>
+        <w:t>seeks_treatment</w:t>
+      </w:r>
+      <w:r>
+        <w:t xml:space="preserve"> (Yes/No), indicating whether the individual sought mental health treatment.</w:t>
+      </w:r>
+    </w:p>
+    <w:p>
+      <w:r>
+        <w:t>The dataset provides a suitable foundation for predictive modelling, as it contains multiple relevant features that may influence treatment-seeking behaviour.</w:t>
+      </w:r>
+    </w:p>
+    <w:p>
+      <w:r>
+        <w:pict w14:anchorId="2CA07ED6">
+          <v:rect id="_x0000_i1078" style="width:0;height:1.5pt" o:hralign="center" o:hrstd="t" o:hr="t" fillcolor="#a0a0a0" stroked="f"/>
+        </w:pict>
+      </w:r>
+    </w:p>
+    <w:p>
+      <w:pPr>
+        <w:rPr>
+          <w:b/>
+          <w:bCs/>
+        </w:rPr>
+      </w:pPr>
+      <w:r>
+        <w:rPr>
+          <w:rFonts w:ascii="Segoe UI Emoji" w:hAnsi="Segoe UI Emoji" w:cs="Segoe UI Emoji"/>
+          <w:b/>
+          <w:bCs/>
+        </w:rPr>
+        <w:lastRenderedPageBreak/>
+        <w:t>🗓️</w:t>
+      </w:r>
+      <w:r>
+        <w:rPr>
+          <w:b/>
+          <w:bCs/>
+        </w:rPr>
+        <w:t xml:space="preserve"> DAY 3–4 → Methodology (most important section)</w:t>
+      </w:r>
+    </w:p>
+    <w:p>
+      <w:pPr>
+        <w:rPr>
+          <w:b/>
+          <w:bCs/>
+        </w:rPr>
+      </w:pPr>
+      <w:r>
+        <w:rPr>
+          <w:b/>
+          <w:bCs/>
+        </w:rPr>
+        <w:t>SECTION 3 — METHODOLOGY (≈ 1–1.5 pages)</w:t>
+      </w:r>
+    </w:p>
+    <w:p>
+      <w:pPr>
+        <w:rPr>
+          <w:b/>
+          <w:bCs/>
+        </w:rPr>
+      </w:pPr>
+      <w:r>
+        <w:rPr>
+          <w:b/>
+          <w:bCs/>
+        </w:rPr>
+        <w:t>3.1 Data Preprocessing</w:t>
+      </w:r>
+    </w:p>
+    <w:p>
+      <w:r>
+        <w:t>Prior to modelling, the dataset was cleaned and prepared to ensure reliability and consistency. The following preprocessing steps were performed:</w:t>
+      </w:r>
+    </w:p>
+    <w:p>
+      <w:pPr>
+        <w:numPr>
+          <w:ilvl w:val="0"/>
+          <w:numId w:val="8"/>
+        </w:numPr>
+      </w:pPr>
+      <w:r>
+        <w:rPr>
+          <w:b/>
+          <w:bCs/>
+        </w:rPr>
+        <w:t>Exploratory Data Analysis (EDA):</w:t>
+      </w:r>
+    </w:p>
+    <w:p>
+      <w:pPr>
+        <w:numPr>
+          <w:ilvl w:val="1"/>
+          <w:numId w:val="8"/>
+        </w:numPr>
+      </w:pPr>
+      <w:r>
+        <w:t>Missing values and duplicate records were checked and addressed where necessary.</w:t>
+      </w:r>
+    </w:p>
+    <w:p>
+      <w:pPr>
+        <w:numPr>
+          <w:ilvl w:val="1"/>
+          <w:numId w:val="8"/>
+        </w:numPr>
+      </w:pPr>
+      <w:r>
+        <w:t>The distribution of key variables was examined to understand patterns in the data.</w:t>
+      </w:r>
+    </w:p>
+    <w:p>
+      <w:pPr>
+        <w:numPr>
+          <w:ilvl w:val="0"/>
+          <w:numId w:val="8"/>
+        </w:numPr>
+      </w:pPr>
+      <w:r>
+        <w:rPr>
+          <w:b/>
+          <w:bCs/>
+        </w:rPr>
+        <w:t>Feature Engineering:</w:t>
+      </w:r>
+      <w:r>
+        <w:br/>
+        <w:t>To enhance the predictive power of the model, new variables were created, including:</w:t>
+      </w:r>
+    </w:p>
+    <w:p>
+      <w:pPr>
+        <w:numPr>
+          <w:ilvl w:val="1"/>
+          <w:numId w:val="8"/>
+        </w:numPr>
+      </w:pPr>
+      <w:r>
+        <w:rPr>
+          <w:b/>
+          <w:bCs/>
+        </w:rPr>
+        <w:t>Mental Health Composite Score</w:t>
+      </w:r>
+      <w:r>
+        <w:t>, calculated as:</w:t>
+      </w:r>
+      <w:r>
+        <w:br/>
+      </w:r>
+      <w:r>
+        <w:rPr>
+          <w:i/>
+          <w:iCs/>
+        </w:rPr>
+        <w:t>depression_score + anxiety_score – social_support_score</w:t>
+      </w:r>
+    </w:p>
+    <w:p>
+      <w:pPr>
+        <w:numPr>
+          <w:ilvl w:val="1"/>
+          <w:numId w:val="8"/>
+        </w:numPr>
+      </w:pPr>
+      <w:r>
+        <w:rPr>
+          <w:b/>
+          <w:bCs/>
+        </w:rPr>
+        <w:t>Sleep-Activity Ratio</w:t>
+      </w:r>
+      <w:r>
+        <w:t>, representing the relationship between sleep duration and physical activity.</w:t>
+      </w:r>
+    </w:p>
+    <w:p>
+      <w:pPr>
+        <w:numPr>
+          <w:ilvl w:val="1"/>
+          <w:numId w:val="8"/>
+        </w:numPr>
+      </w:pPr>
+      <w:r>
+        <w:rPr>
+          <w:b/>
+          <w:bCs/>
+        </w:rPr>
+        <w:t>Stress Level Capping</w:t>
+      </w:r>
+      <w:r>
+        <w:t>, where extreme outliers in stress levels were adjusted using the interquartile range (IQR) method.</w:t>
+      </w:r>
+    </w:p>
+    <w:p>
+      <w:pPr>
+        <w:numPr>
+          <w:ilvl w:val="0"/>
+          <w:numId w:val="8"/>
+        </w:numPr>
+      </w:pPr>
+      <w:r>
+        <w:rPr>
+          <w:b/>
+          <w:bCs/>
+        </w:rPr>
+        <w:t>Encoding Categorical Variables:</w:t>
+      </w:r>
+      <w:r>
+        <w:br/>
+        <w:t>Since machine learning models require numerical input, categorical variables such as gender, employment status, work environment, and mental health history were converted into numerical format using one-hot encoding.</w:t>
+      </w:r>
+    </w:p>
+    <w:p>
+      <w:pPr>
+        <w:numPr>
+          <w:ilvl w:val="0"/>
+          <w:numId w:val="8"/>
+        </w:numPr>
+      </w:pPr>
+      <w:r>
+        <w:rPr>
+          <w:b/>
+          <w:bCs/>
+        </w:rPr>
+        <w:t>Data Splitting and Scaling:</w:t>
+      </w:r>
+      <w:r>
+        <w:br/>
+        <w:t xml:space="preserve">The dataset was split into training (80%) and testing (20%) sets using a stratified split to maintain class balance. Numerical features were standardized using </w:t>
+      </w:r>
+      <w:r>
+        <w:rPr>
+          <w:b/>
+          <w:bCs/>
+        </w:rPr>
+        <w:t>StandardScaler</w:t>
+      </w:r>
+      <w:r>
+        <w:t xml:space="preserve"> to ensure equal contribution to the model.</w:t>
+      </w:r>
+    </w:p>
+    <w:p>
+      <w:r>
+        <w:pict w14:anchorId="242EB52E">
+          <v:rect id="_x0000_i1079" style="width:0;height:1.5pt" o:hralign="center" o:hrstd="t" o:hr="t" fillcolor="#a0a0a0" stroked="f"/>
+        </w:pict>
+      </w:r>
+    </w:p>
+    <w:p>
+      <w:pPr>
+        <w:rPr>
+          <w:b/>
+          <w:bCs/>
+        </w:rPr>
+      </w:pPr>
+      <w:r>
+        <w:rPr>
+          <w:b/>
+          <w:bCs/>
+        </w:rPr>
+        <w:t>3.2 Modelling Approach</w:t>
+      </w:r>
+    </w:p>
+    <w:p>
+      <w:r>
+        <w:t xml:space="preserve">A </w:t>
+      </w:r>
+      <w:r>
+        <w:rPr>
+          <w:b/>
+          <w:bCs/>
+        </w:rPr>
+        <w:t>Logistic Regression</w:t>
+      </w:r>
+      <w:r>
+        <w:t xml:space="preserve"> model was selected for this study because:</w:t>
+      </w:r>
+    </w:p>
+    <w:p>
+      <w:pPr>
+        <w:numPr>
+          <w:ilvl w:val="0"/>
+          <w:numId w:val="9"/>
+        </w:numPr>
+      </w:pPr>
+      <w:r>
+        <w:t>It is interpretable and suitable for binary classification problems.</w:t>
+      </w:r>
+    </w:p>
+    <w:p>
+      <w:pPr>
+        <w:numPr>
+          <w:ilvl w:val="0"/>
+          <w:numId w:val="9"/>
+        </w:numPr>
+      </w:pPr>
+      <w:r>
+        <w:lastRenderedPageBreak/>
+        <w:t>It provides insights into how each feature influences the likelihood of seeking treatment.</w:t>
+      </w:r>
+    </w:p>
+    <w:p>
+      <w:pPr>
+        <w:numPr>
+          <w:ilvl w:val="0"/>
+          <w:numId w:val="9"/>
+        </w:numPr>
+      </w:pPr>
+      <w:r>
+        <w:t>It performs well with structured, tabular data.</w:t>
+      </w:r>
+    </w:p>
+    <w:p>
+      <w:r>
+        <w:t>To improve model performance, class imbalance was addressed using balanced class weights, and hyperparameter tuning was conducted using GridSearchCV with cross-validation.</w:t>
+      </w:r>
+    </w:p>
+    <w:p>
+      <w:r>
+        <w:pict w14:anchorId="2EE96C98">
+          <v:rect id="_x0000_i1080" style="width:0;height:1.5pt" o:hralign="center" o:hrstd="t" o:hr="t" fillcolor="#a0a0a0" stroked="f"/>
+        </w:pict>
+      </w:r>
+    </w:p>
+    <w:p>
+      <w:pPr>
+        <w:rPr>
+          <w:b/>
+          <w:bCs/>
+        </w:rPr>
+      </w:pPr>
+      <w:r>
+        <w:rPr>
+          <w:rFonts w:ascii="Segoe UI Emoji" w:hAnsi="Segoe UI Emoji" w:cs="Segoe UI Emoji"/>
+          <w:b/>
+          <w:bCs/>
+        </w:rPr>
+        <w:t>🗓️</w:t>
+      </w:r>
+      <w:r>
+        <w:rPr>
+          <w:b/>
+          <w:bCs/>
+        </w:rPr>
+        <w:t xml:space="preserve"> DAY 5 → Results Section</w:t>
+      </w:r>
+    </w:p>
+    <w:p>
+      <w:pPr>
+        <w:rPr>
+          <w:b/>
+          <w:bCs/>
+        </w:rPr>
+      </w:pPr>
+      <w:r>
+        <w:rPr>
+          <w:b/>
+          <w:bCs/>
+        </w:rPr>
+        <w:t>SECTION 4 — RESULTS (≈ 1 page)</w:t>
+      </w:r>
+    </w:p>
+    <w:p>
+      <w:r>
+        <w:t>The Logistic Regression model achieved the following performance metrics on the test dataset:</w:t>
+      </w:r>
+    </w:p>
+    <w:p>
+      <w:pPr>
+        <w:numPr>
+          <w:ilvl w:val="0"/>
+          <w:numId w:val="10"/>
+        </w:numPr>
+      </w:pPr>
+      <w:r>
+        <w:rPr>
+          <w:b/>
+          <w:bCs/>
+        </w:rPr>
+        <w:t>Accuracy:</w:t>
+      </w:r>
+      <w:r>
+        <w:t xml:space="preserve"> </w:t>
+      </w:r>
+      <w:r>
+        <w:rPr>
+          <w:i/>
+          <w:iCs/>
+        </w:rPr>
+        <w:t>[insert your value]</w:t>
+      </w:r>
+    </w:p>
+    <w:p>
+      <w:pPr>
+        <w:numPr>
+          <w:ilvl w:val="0"/>
+          <w:numId w:val="10"/>
+        </w:numPr>
+      </w:pPr>
+      <w:r>
+        <w:rPr>
+          <w:b/>
+          <w:bCs/>
+        </w:rPr>
+        <w:t>ROC-AUC Score:</w:t>
+      </w:r>
+      <w:r>
+        <w:t xml:space="preserve"> </w:t>
+      </w:r>
+      <w:r>
+        <w:rPr>
+          <w:i/>
+          <w:iCs/>
+        </w:rPr>
+        <w:t>[insert your value]</w:t>
+      </w:r>
+    </w:p>
+    <w:p>
+      <w:r>
+        <w:t>The confusion matrix indicated that the model was able to correctly classify a significant proportion of individuals who sought treatment, while maintaining reasonable performance in identifying those who did not.</w:t>
+      </w:r>
+    </w:p>
+    <w:p>
+      <w:r>
+        <w:t>A Receiver Operating Characteristic (ROC) curve was plotted to evaluate the trade-off between sensitivity and specificity. The curve demonstrated that the model performed substantially better than random guessing.</w:t>
+      </w:r>
+    </w:p>
+    <w:p>
+      <w:r>
+        <w:t>Feature importance analysis revealed that the most influential predictors of treatment-seeking behaviour included:</w:t>
+      </w:r>
+    </w:p>
+    <w:p>
+      <w:pPr>
+        <w:numPr>
+          <w:ilvl w:val="0"/>
+          <w:numId w:val="11"/>
+        </w:numPr>
+      </w:pPr>
+      <w:r>
+        <w:t>Depression score</w:t>
+      </w:r>
+    </w:p>
+    <w:p>
+      <w:pPr>
+        <w:numPr>
+          <w:ilvl w:val="0"/>
+          <w:numId w:val="11"/>
+        </w:numPr>
+      </w:pPr>
+      <w:r>
+        <w:t>Anxiety score</w:t>
+      </w:r>
+    </w:p>
+    <w:p>
+      <w:pPr>
+        <w:numPr>
+          <w:ilvl w:val="0"/>
+          <w:numId w:val="11"/>
+        </w:numPr>
+      </w:pPr>
+      <w:r>
+        <w:t>Stress level</w:t>
+      </w:r>
+    </w:p>
+    <w:p>
+      <w:pPr>
+        <w:numPr>
+          <w:ilvl w:val="0"/>
+          <w:numId w:val="11"/>
+        </w:numPr>
+      </w:pPr>
+      <w:r>
+        <w:t>Social support score</w:t>
+      </w:r>
+    </w:p>
+    <w:p>
+      <w:pPr>
+        <w:numPr>
+          <w:ilvl w:val="0"/>
+          <w:numId w:val="11"/>
+        </w:numPr>
+      </w:pPr>
+      <w:r>
+        <w:t>Sleep hours</w:t>
+      </w:r>
+    </w:p>
+    <w:p>
+      <w:r>
+        <w:t>These results suggest that psychological distress and social support play a major role in determining whether individuals seek mental health assistance.</w:t>
+      </w:r>
+    </w:p>
+    <w:p>
+      <w:r>
+        <w:pict w14:anchorId="4BF7D69D">
+          <v:rect id="_x0000_i1081" style="width:0;height:1.5pt" o:hralign="center" o:hrstd="t" o:hr="t" fillcolor="#a0a0a0" stroked="f"/>
+        </w:pict>
+      </w:r>
+    </w:p>
+    <w:p>
+      <w:pPr>
+        <w:rPr>
+          <w:b/>
+          <w:bCs/>
+        </w:rPr>
+      </w:pPr>
+      <w:r>
+        <w:rPr>
+          <w:rFonts w:ascii="Segoe UI Emoji" w:hAnsi="Segoe UI Emoji" w:cs="Segoe UI Emoji"/>
+          <w:b/>
+          <w:bCs/>
+        </w:rPr>
+        <w:t>🗓️</w:t>
+      </w:r>
+      <w:r>
+        <w:rPr>
+          <w:b/>
+          <w:bCs/>
+        </w:rPr>
+        <w:t xml:space="preserve"> DAY 6 → Discussion Section</w:t>
+      </w:r>
+    </w:p>
+    <w:p>
+      <w:pPr>
+        <w:rPr>
+          <w:b/>
+          <w:bCs/>
+        </w:rPr>
+      </w:pPr>
+      <w:r>
+        <w:rPr>
+          <w:b/>
+          <w:bCs/>
+        </w:rPr>
+        <w:t>SECTION 5 — DISCUSSION (≈ ¾ page)</w:t>
+      </w:r>
+    </w:p>
+    <w:p>
+      <w:r>
+        <w:lastRenderedPageBreak/>
+        <w:t>The findings of this study highlight the strong relationship between mental health indicators and treatment-seeking behaviour. Higher levels of depression, anxiety, and stress were associated with an increased likelihood of seeking treatment, while stronger social support appeared to reduce this likelihood, possibly because individuals receive informal support from friends or family.</w:t>
+      </w:r>
+    </w:p>
+    <w:p>
+      <w:r>
+        <w:t>The model demonstrates the potential of machine learning in identifying individuals who may benefit from mental health services. However, several limitations should be acknowledged:</w:t>
+      </w:r>
+    </w:p>
+    <w:p>
+      <w:pPr>
+        <w:numPr>
+          <w:ilvl w:val="0"/>
+          <w:numId w:val="12"/>
+        </w:numPr>
+      </w:pPr>
+      <w:r>
+        <w:t>The dataset is relatively small, which may limit generalizability.</w:t>
+      </w:r>
+    </w:p>
+    <w:p>
+      <w:pPr>
+        <w:numPr>
+          <w:ilvl w:val="0"/>
+          <w:numId w:val="12"/>
+        </w:numPr>
+      </w:pPr>
+      <w:r>
+        <w:t>Self-reported data may contain biases or inaccuracies.</w:t>
+      </w:r>
+    </w:p>
+    <w:p>
+      <w:pPr>
+        <w:numPr>
+          <w:ilvl w:val="0"/>
+          <w:numId w:val="12"/>
+        </w:numPr>
+      </w:pPr>
+      <w:r>
+        <w:t>The model does not capture all possible factors influencing treatment-seeking behaviour, such as cultural or financial barriers.</w:t>
+      </w:r>
+    </w:p>
+    <w:p>
+      <w:r>
+        <w:t>Future research could incorporate larger and more diverse datasets, as well as additional psychological and socioeconomic variables.</w:t>
+      </w:r>
+    </w:p>
+    <w:p>
+      <w:r>
+        <w:pict w14:anchorId="7DF1253D">
+          <v:rect id="_x0000_i1082" style="width:0;height:1.5pt" o:hralign="center" o:hrstd="t" o:hr="t" fillcolor="#a0a0a0" stroked="f"/>
+        </w:pict>
+      </w:r>
+    </w:p>
+    <w:p>
+      <w:pPr>
+        <w:rPr>
+          <w:b/>
+          <w:bCs/>
+        </w:rPr>
+      </w:pPr>
+      <w:r>
+        <w:rPr>
+          <w:rFonts w:ascii="Segoe UI Emoji" w:hAnsi="Segoe UI Emoji" w:cs="Segoe UI Emoji"/>
+          <w:b/>
+          <w:bCs/>
+        </w:rPr>
+        <w:t>🗓️</w:t>
+      </w:r>
+      <w:r>
+        <w:rPr>
+          <w:b/>
+          <w:bCs/>
+        </w:rPr>
+        <w:t xml:space="preserve"> DAY 7 → Git Workflow Section + References</w:t>
+      </w:r>
+    </w:p>
+    <w:p>
+      <w:pPr>
+        <w:rPr>
+          <w:b/>
+          <w:bCs/>
+        </w:rPr>
+      </w:pPr>
+      <w:r>
+        <w:rPr>
+          <w:b/>
+          <w:bCs/>
+        </w:rPr>
+        <w:t>SECTION 6 — GIT WORKFLOW (short paragraph)</w:t>
+      </w:r>
+    </w:p>
+    <w:p>
+      <w:r>
+        <w:t>Throughout this project, Git was used for version control. Regular commits were made at each stage of development, including data preprocessing, feature engineering, model training, and evaluation. Clear commit messages were used to document progress, and the final code and report were uploaded to a GitHub repository for transparency and reproducibility.</w:t>
+      </w:r>
+    </w:p>
+    <w:p>
+      <w:r>
+        <w:pict w14:anchorId="272E9E0E">
+          <v:rect id="_x0000_i1083" style="width:0;height:1.5pt" o:hralign="center" o:hrstd="t" o:hr="t" fillcolor="#a0a0a0" stroked="f"/>
+        </w:pict>
+      </w:r>
+    </w:p>
+    <w:p>
+      <w:pPr>
+        <w:rPr>
+          <w:b/>
+          <w:bCs/>
+        </w:rPr>
+      </w:pPr>
+      <w:r>
+        <w:rPr>
+          <w:b/>
+          <w:bCs/>
+        </w:rPr>
+        <w:t>REFERENCES (add at the end)</w:t>
+      </w:r>
+    </w:p>
+    <w:p>
+      <w:r>
+        <w:t>Example format:</w:t>
+      </w:r>
+    </w:p>
+    <w:p>
+      <w:pPr>
+        <w:numPr>
+          <w:ilvl w:val="0"/>
+          <w:numId w:val="13"/>
+        </w:numPr>
+      </w:pPr>
+      <w:r>
+        <w:t>Kaggle. (2024). Sleep Health and Lifestyle Dataset.</w:t>
+      </w:r>
+    </w:p>
+    <w:p>
+      <w:pPr>
+        <w:numPr>
+          <w:ilvl w:val="0"/>
+          <w:numId w:val="13"/>
+        </w:numPr>
+      </w:pPr>
+      <w:r>
+        <w:t>Scikit-learn docum</w:t>
+      </w:r>
+    </w:p>
+    <w:p>
+      <w:pPr>
+        <w:rPr>
+          <w:b/>
+          <w:bCs/>
+        </w:rPr>
+      </w:pPr>
+      <w:r>
+        <w:rPr>
+          <w:b/>
+          <w:bCs/>
+        </w:rPr>
+        <w:t>1. ACTUAL NUMBERS &amp; TABLES</w:t>
+      </w:r>
+    </w:p>
+    <w:p>
+      <w:r>
+        <w:t>Replace placeholders with </w:t>
+      </w:r>
+      <w:r>
+        <w:rPr>
+          <w:b/>
+          <w:bCs/>
+        </w:rPr>
+        <w:t>your actual results</w:t>
+      </w:r>
+      <w:r>
+        <w:t>:</w:t>
+      </w:r>
+    </w:p>
+    <w:p>
+      <w:pPr>
+        <w:numPr>
+          <w:ilvl w:val="0"/>
+          <w:numId w:val="14"/>
+        </w:numPr>
+      </w:pPr>
+      <w:r>
+        <w:rPr>
+          <w:b/>
+          <w:bCs/>
+        </w:rPr>
+        <w:t>Accuracy:</w:t>
+      </w:r>
+      <w:r>
+        <w:t> 0.XX (from your confusion matrix)</w:t>
+      </w:r>
+    </w:p>
+    <w:p>
+      <w:pPr>
+        <w:numPr>
+          <w:ilvl w:val="0"/>
+          <w:numId w:val="14"/>
+        </w:numPr>
+      </w:pPr>
+      <w:r>
+        <w:rPr>
+          <w:b/>
+          <w:bCs/>
+        </w:rPr>
+        <w:t>ROC-AUC:</w:t>
+      </w:r>
+      <w:r>
+        <w:t> 0.XX (calculate if needed)</w:t>
+      </w:r>
+    </w:p>
+    <w:p>
+      <w:pPr>
+        <w:numPr>
+          <w:ilvl w:val="0"/>
+          <w:numId w:val="14"/>
+        </w:numPr>
+      </w:pPr>
+      <w:r>
+        <w:rPr>
+          <w:b/>
+          <w:bCs/>
+        </w:rPr>
+        <w:lastRenderedPageBreak/>
+        <w:t>Add Table 1:</w:t>
+      </w:r>
+      <w:r>
+        <w:t> Descriptive statistics (mean, std for key variables)</w:t>
+      </w:r>
+    </w:p>
+    <w:p>
+      <w:pPr>
+        <w:numPr>
+          <w:ilvl w:val="0"/>
+          <w:numId w:val="14"/>
+        </w:numPr>
+      </w:pPr>
+      <w:r>
+        <w:rPr>
+          <w:b/>
+          <w:bCs/>
+        </w:rPr>
+        <w:t>Add Table 2:</w:t>
+      </w:r>
+      <w:r>
+        <w:t> Correlation matrix (top 5 correlations with target)</w:t>
+      </w:r>
+    </w:p>
+    <w:p>
+      <w:pPr>
+        <w:numPr>
+          <w:ilvl w:val="0"/>
+          <w:numId w:val="14"/>
+        </w:numPr>
+      </w:pPr>
+      <w:r>
+        <w:rPr>
+          <w:b/>
+          <w:bCs/>
+        </w:rPr>
+        <w:t>Add Table 3:</w:t>
+      </w:r>
+      <w:r>
+        <w:t> Model performance metrics</w:t>
+      </w:r>
+    </w:p>
+    <w:p>
+      <w:pPr>
+        <w:rPr>
+          <w:b/>
+          <w:bCs/>
+        </w:rPr>
+      </w:pPr>
+      <w:r>
+        <w:rPr>
+          <w:b/>
+          <w:bCs/>
+        </w:rPr>
+        <w:t>2. VISUALIZATIONS (MUST!)</w:t>
+      </w:r>
+    </w:p>
+    <w:p>
+      <w:r>
+        <w:t>Add </w:t>
+      </w:r>
+      <w:r>
+        <w:rPr>
+          <w:b/>
+          <w:bCs/>
+        </w:rPr>
+        <w:t>figure captions</w:t>
+      </w:r>
+      <w:r>
+        <w:t> referencing your 6 PNG files:</w:t>
+      </w:r>
+    </w:p>
+    <w:p>
+      <w:r>
+        <w:t>text</w:t>
+      </w:r>
+    </w:p>
+    <w:p>
+      <w:r>
+        <w:t>**Figure 1:** Correlation heatmap showing relationships between key variables</w:t>
+      </w:r>
+    </w:p>
+    <w:p>
+      <w:r>
+        <w:t>**Figure 2:** Scatter plot of GDP vs Life Expectancy with regression line</w:t>
+      </w:r>
+    </w:p>
+    <w:p>
+      <w:r>
+        <w:t>**Figure 3:** Box plot comparing life expectancy by development status</w:t>
+      </w:r>
+    </w:p>
+    <w:p>
+      <w:r>
+        <w:t>**Figure 4:** ANOVA results across GDP categories</w:t>
+      </w:r>
+    </w:p>
+    <w:p>
+      <w:r>
+        <w:t>**Figure 5:** Time series trends for four representative countries</w:t>
+      </w:r>
+    </w:p>
+    <w:p>
+      <w:r>
+        <w:t>**Figure 6:** Top and bottom 10 countries by life expectancy</w:t>
+      </w:r>
+    </w:p>
+    <w:p>
+      <w:pPr>
+        <w:rPr>
+          <w:b/>
+          <w:bCs/>
+        </w:rPr>
+      </w:pPr>
+      <w:r>
+        <w:rPr>
+          <w:b/>
+          <w:bCs/>
+        </w:rPr>
+        <w:t>3. STATISTICAL TEST RESULTS</w:t>
+      </w:r>
+    </w:p>
+    <w:p>
+      <w:r>
+        <w:t>Add </w:t>
+      </w:r>
+      <w:r>
+        <w:rPr>
+          <w:b/>
+          <w:bCs/>
+        </w:rPr>
+        <w:t>specific numbers</w:t>
+      </w:r>
+      <w:r>
+        <w:t> from your analysis:</w:t>
+      </w:r>
+    </w:p>
+    <w:p>
+      <w:pPr>
+        <w:numPr>
+          <w:ilvl w:val="0"/>
+          <w:numId w:val="15"/>
+        </w:numPr>
+      </w:pPr>
+      <w:r>
+        <w:t>T-test: t(XX) = 47.87, p &lt; 0.001, d = 1.74</w:t>
+      </w:r>
+    </w:p>
+    <w:p>
+      <w:pPr>
+        <w:numPr>
+          <w:ilvl w:val="0"/>
+          <w:numId w:val="15"/>
+        </w:numPr>
+      </w:pPr>
+      <w:r>
+        <w:t>ANOVA: F(2, XX) = 691.15, p &lt; 0.001</w:t>
+      </w:r>
+    </w:p>
+    <w:p>
+      <w:pPr>
+        <w:numPr>
+          <w:ilvl w:val="0"/>
+          <w:numId w:val="15"/>
+        </w:numPr>
+      </w:pPr>
+      <w:r>
+        <w:t>Spearman correlations with exact ρ values</w:t>
+      </w:r>
+    </w:p>
+    <w:p>
+      <w:pPr>
+        <w:numPr>
+          <w:ilvl w:val="0"/>
+          <w:numId w:val="15"/>
+        </w:numPr>
+      </w:pPr>
+      <w:r>
+        <w:t>Regression equation with coefficients</w:t>
+      </w:r>
+    </w:p>
+    <w:p>
+      <w:pPr>
+        <w:rPr>
+          <w:b/>
+          <w:bCs/>
+        </w:rPr>
+      </w:pPr>
+      <w:r>
+        <w:rPr>
+          <w:b/>
+          <w:bCs/>
+        </w:rPr>
+        <w:t>4. GITHUB SECTION</w:t>
+      </w:r>
+    </w:p>
+    <w:p>
+      <w:r>
+        <w:t>text</w:t>
+      </w:r>
+    </w:p>
+    <w:p>
+      <w:r>
+        <w:t>## 7. CODE AVAILABILITY</w:t>
+      </w:r>
+    </w:p>
+    <w:p/>
+    <w:p>
+      <w:r>
+        <w:t>All analysis code, data, and visualizations are publicly available at:</w:t>
+      </w:r>
+    </w:p>
+    <w:p>
+      <w:r>
+        <w:t>https://github.com/YOUR-USERNAME/data-science-coursework2</w:t>
+      </w:r>
+    </w:p>
+    <w:p/>
+    <w:p>
+      <w:r>
+        <w:t>Repository includes:</w:t>
+      </w:r>
+    </w:p>
+    <w:p>
+      <w:r>
+        <w:lastRenderedPageBreak/>
+        <w:t>- Jupyter notebook with complete analysis</w:t>
+      </w:r>
+    </w:p>
+    <w:p>
+      <w:r>
+        <w:t>- Cleaned dataset (life_expectancy_final.csv)</w:t>
+      </w:r>
+    </w:p>
+    <w:p>
+      <w:r>
+        <w:t>- All visualization figures (6 PNG files)</w:t>
+      </w:r>
+    </w:p>
+    <w:p>
+      <w:r>
+        <w:t>- Statistical output files (CSV)</w:t>
+      </w:r>
+    </w:p>
+    <w:p>
+      <w:r>
+        <w:t>- This report and presentation slides</w:t>
+      </w:r>
+    </w:p>
+    <w:p/>
+    <w:p>
+      <w:r>
+        <w:t>Commit history documents the development process from data cleaning through final analysis.</w:t>
+      </w:r>
+    </w:p>
+    <w:p>
+      <w:pPr>
+        <w:rPr>
+          <w:b/>
+          <w:bCs/>
+        </w:rPr>
+      </w:pPr>
+      <w:r>
+        <w:rPr>
+          <w:b/>
+          <w:bCs/>
+        </w:rPr>
+        <w:t>5. LIMITATIONS SECTION</w:t>
+      </w:r>
+    </w:p>
+    <w:p>
+      <w:r>
+        <w:t>text</w:t>
+      </w:r>
+    </w:p>
+    <w:p>
+      <w:r>
+        <w:t>## 8. LIMITATIONS</w:t>
+      </w:r>
+    </w:p>
+    <w:p/>
+    <w:p>
+      <w:r>
+        <w:t>1. **Data Quality:** Self-reported WHO data may contain reporting biases</w:t>
+      </w:r>
+    </w:p>
+    <w:p>
+      <w:r>
+        <w:t>2. **Confounding Variables:** Factors like healthcare system quality, diet, and genetics not captured</w:t>
+      </w:r>
+    </w:p>
+    <w:p>
+      <w:r>
+        <w:t>3. **Temporal Effects:** 2000-2020 period may not reflect post-pandemic trends</w:t>
+      </w:r>
+    </w:p>
+    <w:p>
+      <w:r>
+        <w:t>4. **Causality:** Correlation does not imply causation</w:t>
+      </w:r>
+    </w:p>
+    <w:p>
+      <w:pPr>
+        <w:rPr>
+          <w:b/>
+          <w:bCs/>
+        </w:rPr>
+      </w:pPr>
+      <w:r>
+        <w:rPr>
+          <w:b/>
+          <w:bCs/>
+        </w:rPr>
+        <w:t>6. APPENDICES (OPTIONAL)</w:t>
+      </w:r>
+    </w:p>
+    <w:p>
+      <w:pPr>
+        <w:numPr>
+          <w:ilvl w:val="0"/>
+          <w:numId w:val="16"/>
+        </w:numPr>
+      </w:pPr>
+      <w:r>
+        <w:rPr>
+          <w:b/>
+          <w:bCs/>
+        </w:rPr>
+        <w:t>Appendix A:</w:t>
+      </w:r>
+      <w:r>
+        <w:t> Complete correlation matrix</w:t>
+      </w:r>
+    </w:p>
+    <w:p>
+      <w:pPr>
+        <w:numPr>
+          <w:ilvl w:val="0"/>
+          <w:numId w:val="16"/>
+        </w:numPr>
+      </w:pPr>
+      <w:r>
+        <w:rPr>
+          <w:b/>
+          <w:bCs/>
+        </w:rPr>
+        <w:t>Appendix B:</w:t>
+      </w:r>
+      <w:r>
+        <w:t> Full regression output</w:t>
+      </w:r>
+    </w:p>
+    <w:p>
+      <w:pPr>
+        <w:numPr>
+          <w:ilvl w:val="0"/>
+          <w:numId w:val="16"/>
+        </w:numPr>
+      </w:pPr>
+      <w:r>
+        <w:rPr>
+          <w:b/>
+          <w:bCs/>
+        </w:rPr>
+        <w:t>Appendix C:</w:t>
+      </w:r>
+      <w:r>
+        <w:t> Country classification list</w:t>
+      </w:r>
+    </w:p>
     <w:p/>
     <w:sectPr>
       <w:pgSz w:w="12240" w:h="15840"/>
@@ -1885,6 +3232,155 @@
     </w:lvl>
   </w:abstractNum>
   <w:abstractNum w:abstractNumId="2" w15:restartNumberingAfterBreak="0">
+    <w:nsid w:val="15FA3E94"/>
+    <w:multiLevelType w:val="multilevel"/>
+    <w:tmpl w:val="FB9C5AA8"/>
+    <w:lvl w:ilvl="0">
+      <w:start w:val="1"/>
+      <w:numFmt w:val="bullet"/>
+      <w:lvlText w:val=""/>
+      <w:lvlJc w:val="left"/>
+      <w:pPr>
+        <w:tabs>
+          <w:tab w:val="num" w:pos="720"/>
+        </w:tabs>
+        <w:ind w:left="720" w:hanging="360"/>
+      </w:pPr>
+      <w:rPr>
+        <w:rFonts w:ascii="Symbol" w:hAnsi="Symbol" w:hint="default"/>
+        <w:sz w:val="20"/>
+      </w:rPr>
+    </w:lvl>
+    <w:lvl w:ilvl="1" w:tentative="1">
+      <w:start w:val="1"/>
+      <w:numFmt w:val="bullet"/>
+      <w:lvlText w:val="o"/>
+      <w:lvlJc w:val="left"/>
+      <w:pPr>
+        <w:tabs>
+          <w:tab w:val="num" w:pos="1440"/>
+        </w:tabs>
+        <w:ind w:left="1440" w:hanging="360"/>
+      </w:pPr>
+      <w:rPr>
+        <w:rFonts w:ascii="Courier New" w:hAnsi="Courier New" w:hint="default"/>
+        <w:sz w:val="20"/>
+      </w:rPr>
+    </w:lvl>
+    <w:lvl w:ilvl="2" w:tentative="1">
+      <w:start w:val="1"/>
+      <w:numFmt w:val="bullet"/>
+      <w:lvlText w:val=""/>
+      <w:lvlJc w:val="left"/>
+      <w:pPr>
+        <w:tabs>
+          <w:tab w:val="num" w:pos="2160"/>
+        </w:tabs>
+        <w:ind w:left="2160" w:hanging="360"/>
+      </w:pPr>
+      <w:rPr>
+        <w:rFonts w:ascii="Wingdings" w:hAnsi="Wingdings" w:hint="default"/>
+        <w:sz w:val="20"/>
+      </w:rPr>
+    </w:lvl>
+    <w:lvl w:ilvl="3" w:tentative="1">
+      <w:start w:val="1"/>
+      <w:numFmt w:val="bullet"/>
+      <w:lvlText w:val=""/>
+      <w:lvlJc w:val="left"/>
+      <w:pPr>
+        <w:tabs>
+          <w:tab w:val="num" w:pos="2880"/>
+        </w:tabs>
+        <w:ind w:left="2880" w:hanging="360"/>
+      </w:pPr>
+      <w:rPr>
+        <w:rFonts w:ascii="Wingdings" w:hAnsi="Wingdings" w:hint="default"/>
+        <w:sz w:val="20"/>
+      </w:rPr>
+    </w:lvl>
+    <w:lvl w:ilvl="4" w:tentative="1">
+      <w:start w:val="1"/>
+      <w:numFmt w:val="bullet"/>
+      <w:lvlText w:val=""/>
+      <w:lvlJc w:val="left"/>
+      <w:pPr>
+        <w:tabs>
+          <w:tab w:val="num" w:pos="3600"/>
+        </w:tabs>
+        <w:ind w:left="3600" w:hanging="360"/>
+      </w:pPr>
+      <w:rPr>
+        <w:rFonts w:ascii="Wingdings" w:hAnsi="Wingdings" w:hint="default"/>
+        <w:sz w:val="20"/>
+      </w:rPr>
+    </w:lvl>
+    <w:lvl w:ilvl="5" w:tentative="1">
+      <w:start w:val="1"/>
+      <w:numFmt w:val="bullet"/>
+      <w:lvlText w:val=""/>
+      <w:lvlJc w:val="left"/>
+      <w:pPr>
+        <w:tabs>
+          <w:tab w:val="num" w:pos="4320"/>
+        </w:tabs>
+        <w:ind w:left="4320" w:hanging="360"/>
+      </w:pPr>
+      <w:rPr>
+        <w:rFonts w:ascii="Wingdings" w:hAnsi="Wingdings" w:hint="default"/>
+        <w:sz w:val="20"/>
+      </w:rPr>
+    </w:lvl>
+    <w:lvl w:ilvl="6" w:tentative="1">
+      <w:start w:val="1"/>
+      <w:numFmt w:val="bullet"/>
+      <w:lvlText w:val=""/>
+      <w:lvlJc w:val="left"/>
+      <w:pPr>
+        <w:tabs>
+          <w:tab w:val="num" w:pos="5040"/>
+        </w:tabs>
+        <w:ind w:left="5040" w:hanging="360"/>
+      </w:pPr>
+      <w:rPr>
+        <w:rFonts w:ascii="Wingdings" w:hAnsi="Wingdings" w:hint="default"/>
+        <w:sz w:val="20"/>
+      </w:rPr>
+    </w:lvl>
+    <w:lvl w:ilvl="7" w:tentative="1">
+      <w:start w:val="1"/>
+      <w:numFmt w:val="bullet"/>
+      <w:lvlText w:val=""/>
+      <w:lvlJc w:val="left"/>
+      <w:pPr>
+        <w:tabs>
+          <w:tab w:val="num" w:pos="5760"/>
+        </w:tabs>
+        <w:ind w:left="5760" w:hanging="360"/>
+      </w:pPr>
+      <w:rPr>
+        <w:rFonts w:ascii="Wingdings" w:hAnsi="Wingdings" w:hint="default"/>
+        <w:sz w:val="20"/>
+      </w:rPr>
+    </w:lvl>
+    <w:lvl w:ilvl="8" w:tentative="1">
+      <w:start w:val="1"/>
+      <w:numFmt w:val="bullet"/>
+      <w:lvlText w:val=""/>
+      <w:lvlJc w:val="left"/>
+      <w:pPr>
+        <w:tabs>
+          <w:tab w:val="num" w:pos="6480"/>
+        </w:tabs>
+        <w:ind w:left="6480" w:hanging="360"/>
+      </w:pPr>
+      <w:rPr>
+        <w:rFonts w:ascii="Wingdings" w:hAnsi="Wingdings" w:hint="default"/>
+        <w:sz w:val="20"/>
+      </w:rPr>
+    </w:lvl>
+  </w:abstractNum>
+  <w:abstractNum w:abstractNumId="3" w15:restartNumberingAfterBreak="0">
     <w:nsid w:val="1818057C"/>
     <w:multiLevelType w:val="multilevel"/>
     <w:tmpl w:val="4678F410"/>
@@ -2033,7 +3529,7 @@
       </w:rPr>
     </w:lvl>
   </w:abstractNum>
-  <w:abstractNum w:abstractNumId="3" w15:restartNumberingAfterBreak="0">
+  <w:abstractNum w:abstractNumId="4" w15:restartNumberingAfterBreak="0">
     <w:nsid w:val="220A1BBD"/>
     <w:multiLevelType w:val="multilevel"/>
     <w:tmpl w:val="B15204D4"/>
@@ -2182,7 +3678,156 @@
       </w:rPr>
     </w:lvl>
   </w:abstractNum>
-  <w:abstractNum w:abstractNumId="4" w15:restartNumberingAfterBreak="0">
+  <w:abstractNum w:abstractNumId="5" w15:restartNumberingAfterBreak="0">
+    <w:nsid w:val="2D556373"/>
+    <w:multiLevelType w:val="multilevel"/>
+    <w:tmpl w:val="DD12A252"/>
+    <w:lvl w:ilvl="0">
+      <w:start w:val="1"/>
+      <w:numFmt w:val="bullet"/>
+      <w:lvlText w:val=""/>
+      <w:lvlJc w:val="left"/>
+      <w:pPr>
+        <w:tabs>
+          <w:tab w:val="num" w:pos="720"/>
+        </w:tabs>
+        <w:ind w:left="720" w:hanging="360"/>
+      </w:pPr>
+      <w:rPr>
+        <w:rFonts w:ascii="Symbol" w:hAnsi="Symbol" w:hint="default"/>
+        <w:sz w:val="20"/>
+      </w:rPr>
+    </w:lvl>
+    <w:lvl w:ilvl="1" w:tentative="1">
+      <w:start w:val="1"/>
+      <w:numFmt w:val="bullet"/>
+      <w:lvlText w:val="o"/>
+      <w:lvlJc w:val="left"/>
+      <w:pPr>
+        <w:tabs>
+          <w:tab w:val="num" w:pos="1440"/>
+        </w:tabs>
+        <w:ind w:left="1440" w:hanging="360"/>
+      </w:pPr>
+      <w:rPr>
+        <w:rFonts w:ascii="Courier New" w:hAnsi="Courier New" w:hint="default"/>
+        <w:sz w:val="20"/>
+      </w:rPr>
+    </w:lvl>
+    <w:lvl w:ilvl="2" w:tentative="1">
+      <w:start w:val="1"/>
+      <w:numFmt w:val="bullet"/>
+      <w:lvlText w:val=""/>
+      <w:lvlJc w:val="left"/>
+      <w:pPr>
+        <w:tabs>
+          <w:tab w:val="num" w:pos="2160"/>
+        </w:tabs>
+        <w:ind w:left="2160" w:hanging="360"/>
+      </w:pPr>
+      <w:rPr>
+        <w:rFonts w:ascii="Wingdings" w:hAnsi="Wingdings" w:hint="default"/>
+        <w:sz w:val="20"/>
+      </w:rPr>
+    </w:lvl>
+    <w:lvl w:ilvl="3" w:tentative="1">
+      <w:start w:val="1"/>
+      <w:numFmt w:val="bullet"/>
+      <w:lvlText w:val=""/>
+      <w:lvlJc w:val="left"/>
+      <w:pPr>
+        <w:tabs>
+          <w:tab w:val="num" w:pos="2880"/>
+        </w:tabs>
+        <w:ind w:left="2880" w:hanging="360"/>
+      </w:pPr>
+      <w:rPr>
+        <w:rFonts w:ascii="Wingdings" w:hAnsi="Wingdings" w:hint="default"/>
+        <w:sz w:val="20"/>
+      </w:rPr>
+    </w:lvl>
+    <w:lvl w:ilvl="4" w:tentative="1">
+      <w:start w:val="1"/>
+      <w:numFmt w:val="bullet"/>
+      <w:lvlText w:val=""/>
+      <w:lvlJc w:val="left"/>
+      <w:pPr>
+        <w:tabs>
+          <w:tab w:val="num" w:pos="3600"/>
+        </w:tabs>
+        <w:ind w:left="3600" w:hanging="360"/>
+      </w:pPr>
+      <w:rPr>
+        <w:rFonts w:ascii="Wingdings" w:hAnsi="Wingdings" w:hint="default"/>
+        <w:sz w:val="20"/>
+      </w:rPr>
+    </w:lvl>
+    <w:lvl w:ilvl="5" w:tentative="1">
+      <w:start w:val="1"/>
+      <w:numFmt w:val="bullet"/>
+      <w:lvlText w:val=""/>
+      <w:lvlJc w:val="left"/>
+      <w:pPr>
+        <w:tabs>
+          <w:tab w:val="num" w:pos="4320"/>
+        </w:tabs>
+        <w:ind w:left="4320" w:hanging="360"/>
+      </w:pPr>
+      <w:rPr>
+        <w:rFonts w:ascii="Wingdings" w:hAnsi="Wingdings" w:hint="default"/>
+        <w:sz w:val="20"/>
+      </w:rPr>
+    </w:lvl>
+    <w:lvl w:ilvl="6" w:tentative="1">
+      <w:start w:val="1"/>
+      <w:numFmt w:val="bullet"/>
+      <w:lvlText w:val=""/>
+      <w:lvlJc w:val="left"/>
+      <w:pPr>
+        <w:tabs>
+          <w:tab w:val="num" w:pos="5040"/>
+        </w:tabs>
+        <w:ind w:left="5040" w:hanging="360"/>
+      </w:pPr>
+      <w:rPr>
+        <w:rFonts w:ascii="Wingdings" w:hAnsi="Wingdings" w:hint="default"/>
+        <w:sz w:val="20"/>
+      </w:rPr>
+    </w:lvl>
+    <w:lvl w:ilvl="7" w:tentative="1">
+      <w:start w:val="1"/>
+      <w:numFmt w:val="bullet"/>
+      <w:lvlText w:val=""/>
+      <w:lvlJc w:val="left"/>
+      <w:pPr>
+        <w:tabs>
+          <w:tab w:val="num" w:pos="5760"/>
+        </w:tabs>
+        <w:ind w:left="5760" w:hanging="360"/>
+      </w:pPr>
+      <w:rPr>
+        <w:rFonts w:ascii="Wingdings" w:hAnsi="Wingdings" w:hint="default"/>
+        <w:sz w:val="20"/>
+      </w:rPr>
+    </w:lvl>
+    <w:lvl w:ilvl="8" w:tentative="1">
+      <w:start w:val="1"/>
+      <w:numFmt w:val="bullet"/>
+      <w:lvlText w:val=""/>
+      <w:lvlJc w:val="left"/>
+      <w:pPr>
+        <w:tabs>
+          <w:tab w:val="num" w:pos="6480"/>
+        </w:tabs>
+        <w:ind w:left="6480" w:hanging="360"/>
+      </w:pPr>
+      <w:rPr>
+        <w:rFonts w:ascii="Wingdings" w:hAnsi="Wingdings" w:hint="default"/>
+        <w:sz w:val="20"/>
+      </w:rPr>
+    </w:lvl>
+  </w:abstractNum>
+  <w:abstractNum w:abstractNumId="6" w15:restartNumberingAfterBreak="0">
     <w:nsid w:val="3BFA1AE0"/>
     <w:multiLevelType w:val="multilevel"/>
     <w:tmpl w:val="4D66BE54"/>
@@ -2331,7 +3976,7 @@
       </w:rPr>
     </w:lvl>
   </w:abstractNum>
-  <w:abstractNum w:abstractNumId="5" w15:restartNumberingAfterBreak="0">
+  <w:abstractNum w:abstractNumId="7" w15:restartNumberingAfterBreak="0">
     <w:nsid w:val="3DE95400"/>
     <w:multiLevelType w:val="multilevel"/>
     <w:tmpl w:val="8196CDFC"/>
@@ -2442,6 +4087,1166 @@
         </w:tabs>
         <w:ind w:left="6480" w:hanging="360"/>
       </w:pPr>
+    </w:lvl>
+  </w:abstractNum>
+  <w:abstractNum w:abstractNumId="8" w15:restartNumberingAfterBreak="0">
+    <w:nsid w:val="4FF52BE3"/>
+    <w:multiLevelType w:val="multilevel"/>
+    <w:tmpl w:val="C37CF16E"/>
+    <w:lvl w:ilvl="0">
+      <w:start w:val="1"/>
+      <w:numFmt w:val="decimal"/>
+      <w:lvlText w:val="%1."/>
+      <w:lvlJc w:val="left"/>
+      <w:pPr>
+        <w:tabs>
+          <w:tab w:val="num" w:pos="720"/>
+        </w:tabs>
+        <w:ind w:left="720" w:hanging="360"/>
+      </w:pPr>
+    </w:lvl>
+    <w:lvl w:ilvl="1">
+      <w:start w:val="1"/>
+      <w:numFmt w:val="bullet"/>
+      <w:lvlText w:val="o"/>
+      <w:lvlJc w:val="left"/>
+      <w:pPr>
+        <w:tabs>
+          <w:tab w:val="num" w:pos="1440"/>
+        </w:tabs>
+        <w:ind w:left="1440" w:hanging="360"/>
+      </w:pPr>
+      <w:rPr>
+        <w:rFonts w:ascii="Courier New" w:hAnsi="Courier New" w:hint="default"/>
+        <w:sz w:val="20"/>
+      </w:rPr>
+    </w:lvl>
+    <w:lvl w:ilvl="2" w:tentative="1">
+      <w:start w:val="1"/>
+      <w:numFmt w:val="decimal"/>
+      <w:lvlText w:val="%3."/>
+      <w:lvlJc w:val="left"/>
+      <w:pPr>
+        <w:tabs>
+          <w:tab w:val="num" w:pos="2160"/>
+        </w:tabs>
+        <w:ind w:left="2160" w:hanging="360"/>
+      </w:pPr>
+    </w:lvl>
+    <w:lvl w:ilvl="3" w:tentative="1">
+      <w:start w:val="1"/>
+      <w:numFmt w:val="decimal"/>
+      <w:lvlText w:val="%4."/>
+      <w:lvlJc w:val="left"/>
+      <w:pPr>
+        <w:tabs>
+          <w:tab w:val="num" w:pos="2880"/>
+        </w:tabs>
+        <w:ind w:left="2880" w:hanging="360"/>
+      </w:pPr>
+    </w:lvl>
+    <w:lvl w:ilvl="4" w:tentative="1">
+      <w:start w:val="1"/>
+      <w:numFmt w:val="decimal"/>
+      <w:lvlText w:val="%5."/>
+      <w:lvlJc w:val="left"/>
+      <w:pPr>
+        <w:tabs>
+          <w:tab w:val="num" w:pos="3600"/>
+        </w:tabs>
+        <w:ind w:left="3600" w:hanging="360"/>
+      </w:pPr>
+    </w:lvl>
+    <w:lvl w:ilvl="5" w:tentative="1">
+      <w:start w:val="1"/>
+      <w:numFmt w:val="decimal"/>
+      <w:lvlText w:val="%6."/>
+      <w:lvlJc w:val="left"/>
+      <w:pPr>
+        <w:tabs>
+          <w:tab w:val="num" w:pos="4320"/>
+        </w:tabs>
+        <w:ind w:left="4320" w:hanging="360"/>
+      </w:pPr>
+    </w:lvl>
+    <w:lvl w:ilvl="6" w:tentative="1">
+      <w:start w:val="1"/>
+      <w:numFmt w:val="decimal"/>
+      <w:lvlText w:val="%7."/>
+      <w:lvlJc w:val="left"/>
+      <w:pPr>
+        <w:tabs>
+          <w:tab w:val="num" w:pos="5040"/>
+        </w:tabs>
+        <w:ind w:left="5040" w:hanging="360"/>
+      </w:pPr>
+    </w:lvl>
+    <w:lvl w:ilvl="7" w:tentative="1">
+      <w:start w:val="1"/>
+      <w:numFmt w:val="decimal"/>
+      <w:lvlText w:val="%8."/>
+      <w:lvlJc w:val="left"/>
+      <w:pPr>
+        <w:tabs>
+          <w:tab w:val="num" w:pos="5760"/>
+        </w:tabs>
+        <w:ind w:left="5760" w:hanging="360"/>
+      </w:pPr>
+    </w:lvl>
+    <w:lvl w:ilvl="8" w:tentative="1">
+      <w:start w:val="1"/>
+      <w:numFmt w:val="decimal"/>
+      <w:lvlText w:val="%9."/>
+      <w:lvlJc w:val="left"/>
+      <w:pPr>
+        <w:tabs>
+          <w:tab w:val="num" w:pos="6480"/>
+        </w:tabs>
+        <w:ind w:left="6480" w:hanging="360"/>
+      </w:pPr>
+    </w:lvl>
+  </w:abstractNum>
+  <w:abstractNum w:abstractNumId="9" w15:restartNumberingAfterBreak="0">
+    <w:nsid w:val="564D0DE3"/>
+    <w:multiLevelType w:val="multilevel"/>
+    <w:tmpl w:val="D242CEFE"/>
+    <w:lvl w:ilvl="0">
+      <w:start w:val="1"/>
+      <w:numFmt w:val="bullet"/>
+      <w:lvlText w:val=""/>
+      <w:lvlJc w:val="left"/>
+      <w:pPr>
+        <w:tabs>
+          <w:tab w:val="num" w:pos="720"/>
+        </w:tabs>
+        <w:ind w:left="720" w:hanging="360"/>
+      </w:pPr>
+      <w:rPr>
+        <w:rFonts w:ascii="Symbol" w:hAnsi="Symbol" w:hint="default"/>
+        <w:sz w:val="20"/>
+      </w:rPr>
+    </w:lvl>
+    <w:lvl w:ilvl="1" w:tentative="1">
+      <w:start w:val="1"/>
+      <w:numFmt w:val="bullet"/>
+      <w:lvlText w:val="o"/>
+      <w:lvlJc w:val="left"/>
+      <w:pPr>
+        <w:tabs>
+          <w:tab w:val="num" w:pos="1440"/>
+        </w:tabs>
+        <w:ind w:left="1440" w:hanging="360"/>
+      </w:pPr>
+      <w:rPr>
+        <w:rFonts w:ascii="Courier New" w:hAnsi="Courier New" w:hint="default"/>
+        <w:sz w:val="20"/>
+      </w:rPr>
+    </w:lvl>
+    <w:lvl w:ilvl="2" w:tentative="1">
+      <w:start w:val="1"/>
+      <w:numFmt w:val="bullet"/>
+      <w:lvlText w:val=""/>
+      <w:lvlJc w:val="left"/>
+      <w:pPr>
+        <w:tabs>
+          <w:tab w:val="num" w:pos="2160"/>
+        </w:tabs>
+        <w:ind w:left="2160" w:hanging="360"/>
+      </w:pPr>
+      <w:rPr>
+        <w:rFonts w:ascii="Wingdings" w:hAnsi="Wingdings" w:hint="default"/>
+        <w:sz w:val="20"/>
+      </w:rPr>
+    </w:lvl>
+    <w:lvl w:ilvl="3" w:tentative="1">
+      <w:start w:val="1"/>
+      <w:numFmt w:val="bullet"/>
+      <w:lvlText w:val=""/>
+      <w:lvlJc w:val="left"/>
+      <w:pPr>
+        <w:tabs>
+          <w:tab w:val="num" w:pos="2880"/>
+        </w:tabs>
+        <w:ind w:left="2880" w:hanging="360"/>
+      </w:pPr>
+      <w:rPr>
+        <w:rFonts w:ascii="Wingdings" w:hAnsi="Wingdings" w:hint="default"/>
+        <w:sz w:val="20"/>
+      </w:rPr>
+    </w:lvl>
+    <w:lvl w:ilvl="4" w:tentative="1">
+      <w:start w:val="1"/>
+      <w:numFmt w:val="bullet"/>
+      <w:lvlText w:val=""/>
+      <w:lvlJc w:val="left"/>
+      <w:pPr>
+        <w:tabs>
+          <w:tab w:val="num" w:pos="3600"/>
+        </w:tabs>
+        <w:ind w:left="3600" w:hanging="360"/>
+      </w:pPr>
+      <w:rPr>
+        <w:rFonts w:ascii="Wingdings" w:hAnsi="Wingdings" w:hint="default"/>
+        <w:sz w:val="20"/>
+      </w:rPr>
+    </w:lvl>
+    <w:lvl w:ilvl="5" w:tentative="1">
+      <w:start w:val="1"/>
+      <w:numFmt w:val="bullet"/>
+      <w:lvlText w:val=""/>
+      <w:lvlJc w:val="left"/>
+      <w:pPr>
+        <w:tabs>
+          <w:tab w:val="num" w:pos="4320"/>
+        </w:tabs>
+        <w:ind w:left="4320" w:hanging="360"/>
+      </w:pPr>
+      <w:rPr>
+        <w:rFonts w:ascii="Wingdings" w:hAnsi="Wingdings" w:hint="default"/>
+        <w:sz w:val="20"/>
+      </w:rPr>
+    </w:lvl>
+    <w:lvl w:ilvl="6" w:tentative="1">
+      <w:start w:val="1"/>
+      <w:numFmt w:val="bullet"/>
+      <w:lvlText w:val=""/>
+      <w:lvlJc w:val="left"/>
+      <w:pPr>
+        <w:tabs>
+          <w:tab w:val="num" w:pos="5040"/>
+        </w:tabs>
+        <w:ind w:left="5040" w:hanging="360"/>
+      </w:pPr>
+      <w:rPr>
+        <w:rFonts w:ascii="Wingdings" w:hAnsi="Wingdings" w:hint="default"/>
+        <w:sz w:val="20"/>
+      </w:rPr>
+    </w:lvl>
+    <w:lvl w:ilvl="7" w:tentative="1">
+      <w:start w:val="1"/>
+      <w:numFmt w:val="bullet"/>
+      <w:lvlText w:val=""/>
+      <w:lvlJc w:val="left"/>
+      <w:pPr>
+        <w:tabs>
+          <w:tab w:val="num" w:pos="5760"/>
+        </w:tabs>
+        <w:ind w:left="5760" w:hanging="360"/>
+      </w:pPr>
+      <w:rPr>
+        <w:rFonts w:ascii="Wingdings" w:hAnsi="Wingdings" w:hint="default"/>
+        <w:sz w:val="20"/>
+      </w:rPr>
+    </w:lvl>
+    <w:lvl w:ilvl="8" w:tentative="1">
+      <w:start w:val="1"/>
+      <w:numFmt w:val="bullet"/>
+      <w:lvlText w:val=""/>
+      <w:lvlJc w:val="left"/>
+      <w:pPr>
+        <w:tabs>
+          <w:tab w:val="num" w:pos="6480"/>
+        </w:tabs>
+        <w:ind w:left="6480" w:hanging="360"/>
+      </w:pPr>
+      <w:rPr>
+        <w:rFonts w:ascii="Wingdings" w:hAnsi="Wingdings" w:hint="default"/>
+        <w:sz w:val="20"/>
+      </w:rPr>
+    </w:lvl>
+  </w:abstractNum>
+  <w:abstractNum w:abstractNumId="10" w15:restartNumberingAfterBreak="0">
+    <w:nsid w:val="566531EC"/>
+    <w:multiLevelType w:val="multilevel"/>
+    <w:tmpl w:val="B822942C"/>
+    <w:lvl w:ilvl="0">
+      <w:start w:val="1"/>
+      <w:numFmt w:val="bullet"/>
+      <w:lvlText w:val=""/>
+      <w:lvlJc w:val="left"/>
+      <w:pPr>
+        <w:tabs>
+          <w:tab w:val="num" w:pos="720"/>
+        </w:tabs>
+        <w:ind w:left="720" w:hanging="360"/>
+      </w:pPr>
+      <w:rPr>
+        <w:rFonts w:ascii="Symbol" w:hAnsi="Symbol" w:hint="default"/>
+        <w:sz w:val="20"/>
+      </w:rPr>
+    </w:lvl>
+    <w:lvl w:ilvl="1" w:tentative="1">
+      <w:start w:val="1"/>
+      <w:numFmt w:val="bullet"/>
+      <w:lvlText w:val="o"/>
+      <w:lvlJc w:val="left"/>
+      <w:pPr>
+        <w:tabs>
+          <w:tab w:val="num" w:pos="1440"/>
+        </w:tabs>
+        <w:ind w:left="1440" w:hanging="360"/>
+      </w:pPr>
+      <w:rPr>
+        <w:rFonts w:ascii="Courier New" w:hAnsi="Courier New" w:hint="default"/>
+        <w:sz w:val="20"/>
+      </w:rPr>
+    </w:lvl>
+    <w:lvl w:ilvl="2" w:tentative="1">
+      <w:start w:val="1"/>
+      <w:numFmt w:val="bullet"/>
+      <w:lvlText w:val=""/>
+      <w:lvlJc w:val="left"/>
+      <w:pPr>
+        <w:tabs>
+          <w:tab w:val="num" w:pos="2160"/>
+        </w:tabs>
+        <w:ind w:left="2160" w:hanging="360"/>
+      </w:pPr>
+      <w:rPr>
+        <w:rFonts w:ascii="Wingdings" w:hAnsi="Wingdings" w:hint="default"/>
+        <w:sz w:val="20"/>
+      </w:rPr>
+    </w:lvl>
+    <w:lvl w:ilvl="3" w:tentative="1">
+      <w:start w:val="1"/>
+      <w:numFmt w:val="bullet"/>
+      <w:lvlText w:val=""/>
+      <w:lvlJc w:val="left"/>
+      <w:pPr>
+        <w:tabs>
+          <w:tab w:val="num" w:pos="2880"/>
+        </w:tabs>
+        <w:ind w:left="2880" w:hanging="360"/>
+      </w:pPr>
+      <w:rPr>
+        <w:rFonts w:ascii="Wingdings" w:hAnsi="Wingdings" w:hint="default"/>
+        <w:sz w:val="20"/>
+      </w:rPr>
+    </w:lvl>
+    <w:lvl w:ilvl="4" w:tentative="1">
+      <w:start w:val="1"/>
+      <w:numFmt w:val="bullet"/>
+      <w:lvlText w:val=""/>
+      <w:lvlJc w:val="left"/>
+      <w:pPr>
+        <w:tabs>
+          <w:tab w:val="num" w:pos="3600"/>
+        </w:tabs>
+        <w:ind w:left="3600" w:hanging="360"/>
+      </w:pPr>
+      <w:rPr>
+        <w:rFonts w:ascii="Wingdings" w:hAnsi="Wingdings" w:hint="default"/>
+        <w:sz w:val="20"/>
+      </w:rPr>
+    </w:lvl>
+    <w:lvl w:ilvl="5" w:tentative="1">
+      <w:start w:val="1"/>
+      <w:numFmt w:val="bullet"/>
+      <w:lvlText w:val=""/>
+      <w:lvlJc w:val="left"/>
+      <w:pPr>
+        <w:tabs>
+          <w:tab w:val="num" w:pos="4320"/>
+        </w:tabs>
+        <w:ind w:left="4320" w:hanging="360"/>
+      </w:pPr>
+      <w:rPr>
+        <w:rFonts w:ascii="Wingdings" w:hAnsi="Wingdings" w:hint="default"/>
+        <w:sz w:val="20"/>
+      </w:rPr>
+    </w:lvl>
+    <w:lvl w:ilvl="6" w:tentative="1">
+      <w:start w:val="1"/>
+      <w:numFmt w:val="bullet"/>
+      <w:lvlText w:val=""/>
+      <w:lvlJc w:val="left"/>
+      <w:pPr>
+        <w:tabs>
+          <w:tab w:val="num" w:pos="5040"/>
+        </w:tabs>
+        <w:ind w:left="5040" w:hanging="360"/>
+      </w:pPr>
+      <w:rPr>
+        <w:rFonts w:ascii="Wingdings" w:hAnsi="Wingdings" w:hint="default"/>
+        <w:sz w:val="20"/>
+      </w:rPr>
+    </w:lvl>
+    <w:lvl w:ilvl="7" w:tentative="1">
+      <w:start w:val="1"/>
+      <w:numFmt w:val="bullet"/>
+      <w:lvlText w:val=""/>
+      <w:lvlJc w:val="left"/>
+      <w:pPr>
+        <w:tabs>
+          <w:tab w:val="num" w:pos="5760"/>
+        </w:tabs>
+        <w:ind w:left="5760" w:hanging="360"/>
+      </w:pPr>
+      <w:rPr>
+        <w:rFonts w:ascii="Wingdings" w:hAnsi="Wingdings" w:hint="default"/>
+        <w:sz w:val="20"/>
+      </w:rPr>
+    </w:lvl>
+    <w:lvl w:ilvl="8" w:tentative="1">
+      <w:start w:val="1"/>
+      <w:numFmt w:val="bullet"/>
+      <w:lvlText w:val=""/>
+      <w:lvlJc w:val="left"/>
+      <w:pPr>
+        <w:tabs>
+          <w:tab w:val="num" w:pos="6480"/>
+        </w:tabs>
+        <w:ind w:left="6480" w:hanging="360"/>
+      </w:pPr>
+      <w:rPr>
+        <w:rFonts w:ascii="Wingdings" w:hAnsi="Wingdings" w:hint="default"/>
+        <w:sz w:val="20"/>
+      </w:rPr>
+    </w:lvl>
+  </w:abstractNum>
+  <w:abstractNum w:abstractNumId="11" w15:restartNumberingAfterBreak="0">
+    <w:nsid w:val="59486AE0"/>
+    <w:multiLevelType w:val="multilevel"/>
+    <w:tmpl w:val="DB96AFB0"/>
+    <w:lvl w:ilvl="0">
+      <w:start w:val="1"/>
+      <w:numFmt w:val="bullet"/>
+      <w:lvlText w:val=""/>
+      <w:lvlJc w:val="left"/>
+      <w:pPr>
+        <w:tabs>
+          <w:tab w:val="num" w:pos="720"/>
+        </w:tabs>
+        <w:ind w:left="720" w:hanging="360"/>
+      </w:pPr>
+      <w:rPr>
+        <w:rFonts w:ascii="Symbol" w:hAnsi="Symbol" w:hint="default"/>
+        <w:sz w:val="20"/>
+      </w:rPr>
+    </w:lvl>
+    <w:lvl w:ilvl="1" w:tentative="1">
+      <w:start w:val="1"/>
+      <w:numFmt w:val="bullet"/>
+      <w:lvlText w:val="o"/>
+      <w:lvlJc w:val="left"/>
+      <w:pPr>
+        <w:tabs>
+          <w:tab w:val="num" w:pos="1440"/>
+        </w:tabs>
+        <w:ind w:left="1440" w:hanging="360"/>
+      </w:pPr>
+      <w:rPr>
+        <w:rFonts w:ascii="Courier New" w:hAnsi="Courier New" w:hint="default"/>
+        <w:sz w:val="20"/>
+      </w:rPr>
+    </w:lvl>
+    <w:lvl w:ilvl="2" w:tentative="1">
+      <w:start w:val="1"/>
+      <w:numFmt w:val="bullet"/>
+      <w:lvlText w:val=""/>
+      <w:lvlJc w:val="left"/>
+      <w:pPr>
+        <w:tabs>
+          <w:tab w:val="num" w:pos="2160"/>
+        </w:tabs>
+        <w:ind w:left="2160" w:hanging="360"/>
+      </w:pPr>
+      <w:rPr>
+        <w:rFonts w:ascii="Wingdings" w:hAnsi="Wingdings" w:hint="default"/>
+        <w:sz w:val="20"/>
+      </w:rPr>
+    </w:lvl>
+    <w:lvl w:ilvl="3" w:tentative="1">
+      <w:start w:val="1"/>
+      <w:numFmt w:val="bullet"/>
+      <w:lvlText w:val=""/>
+      <w:lvlJc w:val="left"/>
+      <w:pPr>
+        <w:tabs>
+          <w:tab w:val="num" w:pos="2880"/>
+        </w:tabs>
+        <w:ind w:left="2880" w:hanging="360"/>
+      </w:pPr>
+      <w:rPr>
+        <w:rFonts w:ascii="Wingdings" w:hAnsi="Wingdings" w:hint="default"/>
+        <w:sz w:val="20"/>
+      </w:rPr>
+    </w:lvl>
+    <w:lvl w:ilvl="4" w:tentative="1">
+      <w:start w:val="1"/>
+      <w:numFmt w:val="bullet"/>
+      <w:lvlText w:val=""/>
+      <w:lvlJc w:val="left"/>
+      <w:pPr>
+        <w:tabs>
+          <w:tab w:val="num" w:pos="3600"/>
+        </w:tabs>
+        <w:ind w:left="3600" w:hanging="360"/>
+      </w:pPr>
+      <w:rPr>
+        <w:rFonts w:ascii="Wingdings" w:hAnsi="Wingdings" w:hint="default"/>
+        <w:sz w:val="20"/>
+      </w:rPr>
+    </w:lvl>
+    <w:lvl w:ilvl="5" w:tentative="1">
+      <w:start w:val="1"/>
+      <w:numFmt w:val="bullet"/>
+      <w:lvlText w:val=""/>
+      <w:lvlJc w:val="left"/>
+      <w:pPr>
+        <w:tabs>
+          <w:tab w:val="num" w:pos="4320"/>
+        </w:tabs>
+        <w:ind w:left="4320" w:hanging="360"/>
+      </w:pPr>
+      <w:rPr>
+        <w:rFonts w:ascii="Wingdings" w:hAnsi="Wingdings" w:hint="default"/>
+        <w:sz w:val="20"/>
+      </w:rPr>
+    </w:lvl>
+    <w:lvl w:ilvl="6" w:tentative="1">
+      <w:start w:val="1"/>
+      <w:numFmt w:val="bullet"/>
+      <w:lvlText w:val=""/>
+      <w:lvlJc w:val="left"/>
+      <w:pPr>
+        <w:tabs>
+          <w:tab w:val="num" w:pos="5040"/>
+        </w:tabs>
+        <w:ind w:left="5040" w:hanging="360"/>
+      </w:pPr>
+      <w:rPr>
+        <w:rFonts w:ascii="Wingdings" w:hAnsi="Wingdings" w:hint="default"/>
+        <w:sz w:val="20"/>
+      </w:rPr>
+    </w:lvl>
+    <w:lvl w:ilvl="7" w:tentative="1">
+      <w:start w:val="1"/>
+      <w:numFmt w:val="bullet"/>
+      <w:lvlText w:val=""/>
+      <w:lvlJc w:val="left"/>
+      <w:pPr>
+        <w:tabs>
+          <w:tab w:val="num" w:pos="5760"/>
+        </w:tabs>
+        <w:ind w:left="5760" w:hanging="360"/>
+      </w:pPr>
+      <w:rPr>
+        <w:rFonts w:ascii="Wingdings" w:hAnsi="Wingdings" w:hint="default"/>
+        <w:sz w:val="20"/>
+      </w:rPr>
+    </w:lvl>
+    <w:lvl w:ilvl="8" w:tentative="1">
+      <w:start w:val="1"/>
+      <w:numFmt w:val="bullet"/>
+      <w:lvlText w:val=""/>
+      <w:lvlJc w:val="left"/>
+      <w:pPr>
+        <w:tabs>
+          <w:tab w:val="num" w:pos="6480"/>
+        </w:tabs>
+        <w:ind w:left="6480" w:hanging="360"/>
+      </w:pPr>
+      <w:rPr>
+        <w:rFonts w:ascii="Wingdings" w:hAnsi="Wingdings" w:hint="default"/>
+        <w:sz w:val="20"/>
+      </w:rPr>
+    </w:lvl>
+  </w:abstractNum>
+  <w:abstractNum w:abstractNumId="12" w15:restartNumberingAfterBreak="0">
+    <w:nsid w:val="620230DE"/>
+    <w:multiLevelType w:val="multilevel"/>
+    <w:tmpl w:val="EF02C4F0"/>
+    <w:lvl w:ilvl="0">
+      <w:start w:val="1"/>
+      <w:numFmt w:val="bullet"/>
+      <w:lvlText w:val=""/>
+      <w:lvlJc w:val="left"/>
+      <w:pPr>
+        <w:tabs>
+          <w:tab w:val="num" w:pos="720"/>
+        </w:tabs>
+        <w:ind w:left="720" w:hanging="360"/>
+      </w:pPr>
+      <w:rPr>
+        <w:rFonts w:ascii="Symbol" w:hAnsi="Symbol" w:hint="default"/>
+        <w:sz w:val="20"/>
+      </w:rPr>
+    </w:lvl>
+    <w:lvl w:ilvl="1" w:tentative="1">
+      <w:start w:val="1"/>
+      <w:numFmt w:val="bullet"/>
+      <w:lvlText w:val="o"/>
+      <w:lvlJc w:val="left"/>
+      <w:pPr>
+        <w:tabs>
+          <w:tab w:val="num" w:pos="1440"/>
+        </w:tabs>
+        <w:ind w:left="1440" w:hanging="360"/>
+      </w:pPr>
+      <w:rPr>
+        <w:rFonts w:ascii="Courier New" w:hAnsi="Courier New" w:hint="default"/>
+        <w:sz w:val="20"/>
+      </w:rPr>
+    </w:lvl>
+    <w:lvl w:ilvl="2" w:tentative="1">
+      <w:start w:val="1"/>
+      <w:numFmt w:val="bullet"/>
+      <w:lvlText w:val=""/>
+      <w:lvlJc w:val="left"/>
+      <w:pPr>
+        <w:tabs>
+          <w:tab w:val="num" w:pos="2160"/>
+        </w:tabs>
+        <w:ind w:left="2160" w:hanging="360"/>
+      </w:pPr>
+      <w:rPr>
+        <w:rFonts w:ascii="Wingdings" w:hAnsi="Wingdings" w:hint="default"/>
+        <w:sz w:val="20"/>
+      </w:rPr>
+    </w:lvl>
+    <w:lvl w:ilvl="3" w:tentative="1">
+      <w:start w:val="1"/>
+      <w:numFmt w:val="bullet"/>
+      <w:lvlText w:val=""/>
+      <w:lvlJc w:val="left"/>
+      <w:pPr>
+        <w:tabs>
+          <w:tab w:val="num" w:pos="2880"/>
+        </w:tabs>
+        <w:ind w:left="2880" w:hanging="360"/>
+      </w:pPr>
+      <w:rPr>
+        <w:rFonts w:ascii="Wingdings" w:hAnsi="Wingdings" w:hint="default"/>
+        <w:sz w:val="20"/>
+      </w:rPr>
+    </w:lvl>
+    <w:lvl w:ilvl="4" w:tentative="1">
+      <w:start w:val="1"/>
+      <w:numFmt w:val="bullet"/>
+      <w:lvlText w:val=""/>
+      <w:lvlJc w:val="left"/>
+      <w:pPr>
+        <w:tabs>
+          <w:tab w:val="num" w:pos="3600"/>
+        </w:tabs>
+        <w:ind w:left="3600" w:hanging="360"/>
+      </w:pPr>
+      <w:rPr>
+        <w:rFonts w:ascii="Wingdings" w:hAnsi="Wingdings" w:hint="default"/>
+        <w:sz w:val="20"/>
+      </w:rPr>
+    </w:lvl>
+    <w:lvl w:ilvl="5" w:tentative="1">
+      <w:start w:val="1"/>
+      <w:numFmt w:val="bullet"/>
+      <w:lvlText w:val=""/>
+      <w:lvlJc w:val="left"/>
+      <w:pPr>
+        <w:tabs>
+          <w:tab w:val="num" w:pos="4320"/>
+        </w:tabs>
+        <w:ind w:left="4320" w:hanging="360"/>
+      </w:pPr>
+      <w:rPr>
+        <w:rFonts w:ascii="Wingdings" w:hAnsi="Wingdings" w:hint="default"/>
+        <w:sz w:val="20"/>
+      </w:rPr>
+    </w:lvl>
+    <w:lvl w:ilvl="6" w:tentative="1">
+      <w:start w:val="1"/>
+      <w:numFmt w:val="bullet"/>
+      <w:lvlText w:val=""/>
+      <w:lvlJc w:val="left"/>
+      <w:pPr>
+        <w:tabs>
+          <w:tab w:val="num" w:pos="5040"/>
+        </w:tabs>
+        <w:ind w:left="5040" w:hanging="360"/>
+      </w:pPr>
+      <w:rPr>
+        <w:rFonts w:ascii="Wingdings" w:hAnsi="Wingdings" w:hint="default"/>
+        <w:sz w:val="20"/>
+      </w:rPr>
+    </w:lvl>
+    <w:lvl w:ilvl="7" w:tentative="1">
+      <w:start w:val="1"/>
+      <w:numFmt w:val="bullet"/>
+      <w:lvlText w:val=""/>
+      <w:lvlJc w:val="left"/>
+      <w:pPr>
+        <w:tabs>
+          <w:tab w:val="num" w:pos="5760"/>
+        </w:tabs>
+        <w:ind w:left="5760" w:hanging="360"/>
+      </w:pPr>
+      <w:rPr>
+        <w:rFonts w:ascii="Wingdings" w:hAnsi="Wingdings" w:hint="default"/>
+        <w:sz w:val="20"/>
+      </w:rPr>
+    </w:lvl>
+    <w:lvl w:ilvl="8" w:tentative="1">
+      <w:start w:val="1"/>
+      <w:numFmt w:val="bullet"/>
+      <w:lvlText w:val=""/>
+      <w:lvlJc w:val="left"/>
+      <w:pPr>
+        <w:tabs>
+          <w:tab w:val="num" w:pos="6480"/>
+        </w:tabs>
+        <w:ind w:left="6480" w:hanging="360"/>
+      </w:pPr>
+      <w:rPr>
+        <w:rFonts w:ascii="Wingdings" w:hAnsi="Wingdings" w:hint="default"/>
+        <w:sz w:val="20"/>
+      </w:rPr>
+    </w:lvl>
+  </w:abstractNum>
+  <w:abstractNum w:abstractNumId="13" w15:restartNumberingAfterBreak="0">
+    <w:nsid w:val="75AF0E11"/>
+    <w:multiLevelType w:val="multilevel"/>
+    <w:tmpl w:val="97C26A54"/>
+    <w:lvl w:ilvl="0">
+      <w:start w:val="1"/>
+      <w:numFmt w:val="bullet"/>
+      <w:lvlText w:val=""/>
+      <w:lvlJc w:val="left"/>
+      <w:pPr>
+        <w:tabs>
+          <w:tab w:val="num" w:pos="720"/>
+        </w:tabs>
+        <w:ind w:left="720" w:hanging="360"/>
+      </w:pPr>
+      <w:rPr>
+        <w:rFonts w:ascii="Symbol" w:hAnsi="Symbol" w:hint="default"/>
+        <w:sz w:val="20"/>
+      </w:rPr>
+    </w:lvl>
+    <w:lvl w:ilvl="1" w:tentative="1">
+      <w:start w:val="1"/>
+      <w:numFmt w:val="bullet"/>
+      <w:lvlText w:val="o"/>
+      <w:lvlJc w:val="left"/>
+      <w:pPr>
+        <w:tabs>
+          <w:tab w:val="num" w:pos="1440"/>
+        </w:tabs>
+        <w:ind w:left="1440" w:hanging="360"/>
+      </w:pPr>
+      <w:rPr>
+        <w:rFonts w:ascii="Courier New" w:hAnsi="Courier New" w:hint="default"/>
+        <w:sz w:val="20"/>
+      </w:rPr>
+    </w:lvl>
+    <w:lvl w:ilvl="2" w:tentative="1">
+      <w:start w:val="1"/>
+      <w:numFmt w:val="bullet"/>
+      <w:lvlText w:val=""/>
+      <w:lvlJc w:val="left"/>
+      <w:pPr>
+        <w:tabs>
+          <w:tab w:val="num" w:pos="2160"/>
+        </w:tabs>
+        <w:ind w:left="2160" w:hanging="360"/>
+      </w:pPr>
+      <w:rPr>
+        <w:rFonts w:ascii="Wingdings" w:hAnsi="Wingdings" w:hint="default"/>
+        <w:sz w:val="20"/>
+      </w:rPr>
+    </w:lvl>
+    <w:lvl w:ilvl="3" w:tentative="1">
+      <w:start w:val="1"/>
+      <w:numFmt w:val="bullet"/>
+      <w:lvlText w:val=""/>
+      <w:lvlJc w:val="left"/>
+      <w:pPr>
+        <w:tabs>
+          <w:tab w:val="num" w:pos="2880"/>
+        </w:tabs>
+        <w:ind w:left="2880" w:hanging="360"/>
+      </w:pPr>
+      <w:rPr>
+        <w:rFonts w:ascii="Wingdings" w:hAnsi="Wingdings" w:hint="default"/>
+        <w:sz w:val="20"/>
+      </w:rPr>
+    </w:lvl>
+    <w:lvl w:ilvl="4" w:tentative="1">
+      <w:start w:val="1"/>
+      <w:numFmt w:val="bullet"/>
+      <w:lvlText w:val=""/>
+      <w:lvlJc w:val="left"/>
+      <w:pPr>
+        <w:tabs>
+          <w:tab w:val="num" w:pos="3600"/>
+        </w:tabs>
+        <w:ind w:left="3600" w:hanging="360"/>
+      </w:pPr>
+      <w:rPr>
+        <w:rFonts w:ascii="Wingdings" w:hAnsi="Wingdings" w:hint="default"/>
+        <w:sz w:val="20"/>
+      </w:rPr>
+    </w:lvl>
+    <w:lvl w:ilvl="5" w:tentative="1">
+      <w:start w:val="1"/>
+      <w:numFmt w:val="bullet"/>
+      <w:lvlText w:val=""/>
+      <w:lvlJc w:val="left"/>
+      <w:pPr>
+        <w:tabs>
+          <w:tab w:val="num" w:pos="4320"/>
+        </w:tabs>
+        <w:ind w:left="4320" w:hanging="360"/>
+      </w:pPr>
+      <w:rPr>
+        <w:rFonts w:ascii="Wingdings" w:hAnsi="Wingdings" w:hint="default"/>
+        <w:sz w:val="20"/>
+      </w:rPr>
+    </w:lvl>
+    <w:lvl w:ilvl="6" w:tentative="1">
+      <w:start w:val="1"/>
+      <w:numFmt w:val="bullet"/>
+      <w:lvlText w:val=""/>
+      <w:lvlJc w:val="left"/>
+      <w:pPr>
+        <w:tabs>
+          <w:tab w:val="num" w:pos="5040"/>
+        </w:tabs>
+        <w:ind w:left="5040" w:hanging="360"/>
+      </w:pPr>
+      <w:rPr>
+        <w:rFonts w:ascii="Wingdings" w:hAnsi="Wingdings" w:hint="default"/>
+        <w:sz w:val="20"/>
+      </w:rPr>
+    </w:lvl>
+    <w:lvl w:ilvl="7" w:tentative="1">
+      <w:start w:val="1"/>
+      <w:numFmt w:val="bullet"/>
+      <w:lvlText w:val=""/>
+      <w:lvlJc w:val="left"/>
+      <w:pPr>
+        <w:tabs>
+          <w:tab w:val="num" w:pos="5760"/>
+        </w:tabs>
+        <w:ind w:left="5760" w:hanging="360"/>
+      </w:pPr>
+      <w:rPr>
+        <w:rFonts w:ascii="Wingdings" w:hAnsi="Wingdings" w:hint="default"/>
+        <w:sz w:val="20"/>
+      </w:rPr>
+    </w:lvl>
+    <w:lvl w:ilvl="8" w:tentative="1">
+      <w:start w:val="1"/>
+      <w:numFmt w:val="bullet"/>
+      <w:lvlText w:val=""/>
+      <w:lvlJc w:val="left"/>
+      <w:pPr>
+        <w:tabs>
+          <w:tab w:val="num" w:pos="6480"/>
+        </w:tabs>
+        <w:ind w:left="6480" w:hanging="360"/>
+      </w:pPr>
+      <w:rPr>
+        <w:rFonts w:ascii="Wingdings" w:hAnsi="Wingdings" w:hint="default"/>
+        <w:sz w:val="20"/>
+      </w:rPr>
+    </w:lvl>
+  </w:abstractNum>
+  <w:abstractNum w:abstractNumId="14" w15:restartNumberingAfterBreak="0">
+    <w:nsid w:val="7BBE026F"/>
+    <w:multiLevelType w:val="multilevel"/>
+    <w:tmpl w:val="1B4CBC80"/>
+    <w:lvl w:ilvl="0">
+      <w:start w:val="1"/>
+      <w:numFmt w:val="bullet"/>
+      <w:lvlText w:val=""/>
+      <w:lvlJc w:val="left"/>
+      <w:pPr>
+        <w:tabs>
+          <w:tab w:val="num" w:pos="720"/>
+        </w:tabs>
+        <w:ind w:left="720" w:hanging="360"/>
+      </w:pPr>
+      <w:rPr>
+        <w:rFonts w:ascii="Symbol" w:hAnsi="Symbol" w:hint="default"/>
+        <w:sz w:val="20"/>
+      </w:rPr>
+    </w:lvl>
+    <w:lvl w:ilvl="1" w:tentative="1">
+      <w:start w:val="1"/>
+      <w:numFmt w:val="bullet"/>
+      <w:lvlText w:val="o"/>
+      <w:lvlJc w:val="left"/>
+      <w:pPr>
+        <w:tabs>
+          <w:tab w:val="num" w:pos="1440"/>
+        </w:tabs>
+        <w:ind w:left="1440" w:hanging="360"/>
+      </w:pPr>
+      <w:rPr>
+        <w:rFonts w:ascii="Courier New" w:hAnsi="Courier New" w:hint="default"/>
+        <w:sz w:val="20"/>
+      </w:rPr>
+    </w:lvl>
+    <w:lvl w:ilvl="2" w:tentative="1">
+      <w:start w:val="1"/>
+      <w:numFmt w:val="bullet"/>
+      <w:lvlText w:val=""/>
+      <w:lvlJc w:val="left"/>
+      <w:pPr>
+        <w:tabs>
+          <w:tab w:val="num" w:pos="2160"/>
+        </w:tabs>
+        <w:ind w:left="2160" w:hanging="360"/>
+      </w:pPr>
+      <w:rPr>
+        <w:rFonts w:ascii="Wingdings" w:hAnsi="Wingdings" w:hint="default"/>
+        <w:sz w:val="20"/>
+      </w:rPr>
+    </w:lvl>
+    <w:lvl w:ilvl="3" w:tentative="1">
+      <w:start w:val="1"/>
+      <w:numFmt w:val="bullet"/>
+      <w:lvlText w:val=""/>
+      <w:lvlJc w:val="left"/>
+      <w:pPr>
+        <w:tabs>
+          <w:tab w:val="num" w:pos="2880"/>
+        </w:tabs>
+        <w:ind w:left="2880" w:hanging="360"/>
+      </w:pPr>
+      <w:rPr>
+        <w:rFonts w:ascii="Wingdings" w:hAnsi="Wingdings" w:hint="default"/>
+        <w:sz w:val="20"/>
+      </w:rPr>
+    </w:lvl>
+    <w:lvl w:ilvl="4" w:tentative="1">
+      <w:start w:val="1"/>
+      <w:numFmt w:val="bullet"/>
+      <w:lvlText w:val=""/>
+      <w:lvlJc w:val="left"/>
+      <w:pPr>
+        <w:tabs>
+          <w:tab w:val="num" w:pos="3600"/>
+        </w:tabs>
+        <w:ind w:left="3600" w:hanging="360"/>
+      </w:pPr>
+      <w:rPr>
+        <w:rFonts w:ascii="Wingdings" w:hAnsi="Wingdings" w:hint="default"/>
+        <w:sz w:val="20"/>
+      </w:rPr>
+    </w:lvl>
+    <w:lvl w:ilvl="5" w:tentative="1">
+      <w:start w:val="1"/>
+      <w:numFmt w:val="bullet"/>
+      <w:lvlText w:val=""/>
+      <w:lvlJc w:val="left"/>
+      <w:pPr>
+        <w:tabs>
+          <w:tab w:val="num" w:pos="4320"/>
+        </w:tabs>
+        <w:ind w:left="4320" w:hanging="360"/>
+      </w:pPr>
+      <w:rPr>
+        <w:rFonts w:ascii="Wingdings" w:hAnsi="Wingdings" w:hint="default"/>
+        <w:sz w:val="20"/>
+      </w:rPr>
+    </w:lvl>
+    <w:lvl w:ilvl="6" w:tentative="1">
+      <w:start w:val="1"/>
+      <w:numFmt w:val="bullet"/>
+      <w:lvlText w:val=""/>
+      <w:lvlJc w:val="left"/>
+      <w:pPr>
+        <w:tabs>
+          <w:tab w:val="num" w:pos="5040"/>
+        </w:tabs>
+        <w:ind w:left="5040" w:hanging="360"/>
+      </w:pPr>
+      <w:rPr>
+        <w:rFonts w:ascii="Wingdings" w:hAnsi="Wingdings" w:hint="default"/>
+        <w:sz w:val="20"/>
+      </w:rPr>
+    </w:lvl>
+    <w:lvl w:ilvl="7" w:tentative="1">
+      <w:start w:val="1"/>
+      <w:numFmt w:val="bullet"/>
+      <w:lvlText w:val=""/>
+      <w:lvlJc w:val="left"/>
+      <w:pPr>
+        <w:tabs>
+          <w:tab w:val="num" w:pos="5760"/>
+        </w:tabs>
+        <w:ind w:left="5760" w:hanging="360"/>
+      </w:pPr>
+      <w:rPr>
+        <w:rFonts w:ascii="Wingdings" w:hAnsi="Wingdings" w:hint="default"/>
+        <w:sz w:val="20"/>
+      </w:rPr>
+    </w:lvl>
+    <w:lvl w:ilvl="8" w:tentative="1">
+      <w:start w:val="1"/>
+      <w:numFmt w:val="bullet"/>
+      <w:lvlText w:val=""/>
+      <w:lvlJc w:val="left"/>
+      <w:pPr>
+        <w:tabs>
+          <w:tab w:val="num" w:pos="6480"/>
+        </w:tabs>
+        <w:ind w:left="6480" w:hanging="360"/>
+      </w:pPr>
+      <w:rPr>
+        <w:rFonts w:ascii="Wingdings" w:hAnsi="Wingdings" w:hint="default"/>
+        <w:sz w:val="20"/>
+      </w:rPr>
+    </w:lvl>
+  </w:abstractNum>
+  <w:abstractNum w:abstractNumId="15" w15:restartNumberingAfterBreak="0">
+    <w:nsid w:val="7D7366C1"/>
+    <w:multiLevelType w:val="multilevel"/>
+    <w:tmpl w:val="AAD8BA9C"/>
+    <w:lvl w:ilvl="0">
+      <w:start w:val="1"/>
+      <w:numFmt w:val="bullet"/>
+      <w:lvlText w:val=""/>
+      <w:lvlJc w:val="left"/>
+      <w:pPr>
+        <w:tabs>
+          <w:tab w:val="num" w:pos="720"/>
+        </w:tabs>
+        <w:ind w:left="720" w:hanging="360"/>
+      </w:pPr>
+      <w:rPr>
+        <w:rFonts w:ascii="Symbol" w:hAnsi="Symbol" w:hint="default"/>
+        <w:sz w:val="20"/>
+      </w:rPr>
+    </w:lvl>
+    <w:lvl w:ilvl="1" w:tentative="1">
+      <w:start w:val="1"/>
+      <w:numFmt w:val="bullet"/>
+      <w:lvlText w:val="o"/>
+      <w:lvlJc w:val="left"/>
+      <w:pPr>
+        <w:tabs>
+          <w:tab w:val="num" w:pos="1440"/>
+        </w:tabs>
+        <w:ind w:left="1440" w:hanging="360"/>
+      </w:pPr>
+      <w:rPr>
+        <w:rFonts w:ascii="Courier New" w:hAnsi="Courier New" w:hint="default"/>
+        <w:sz w:val="20"/>
+      </w:rPr>
+    </w:lvl>
+    <w:lvl w:ilvl="2" w:tentative="1">
+      <w:start w:val="1"/>
+      <w:numFmt w:val="bullet"/>
+      <w:lvlText w:val=""/>
+      <w:lvlJc w:val="left"/>
+      <w:pPr>
+        <w:tabs>
+          <w:tab w:val="num" w:pos="2160"/>
+        </w:tabs>
+        <w:ind w:left="2160" w:hanging="360"/>
+      </w:pPr>
+      <w:rPr>
+        <w:rFonts w:ascii="Wingdings" w:hAnsi="Wingdings" w:hint="default"/>
+        <w:sz w:val="20"/>
+      </w:rPr>
+    </w:lvl>
+    <w:lvl w:ilvl="3" w:tentative="1">
+      <w:start w:val="1"/>
+      <w:numFmt w:val="bullet"/>
+      <w:lvlText w:val=""/>
+      <w:lvlJc w:val="left"/>
+      <w:pPr>
+        <w:tabs>
+          <w:tab w:val="num" w:pos="2880"/>
+        </w:tabs>
+        <w:ind w:left="2880" w:hanging="360"/>
+      </w:pPr>
+      <w:rPr>
+        <w:rFonts w:ascii="Wingdings" w:hAnsi="Wingdings" w:hint="default"/>
+        <w:sz w:val="20"/>
+      </w:rPr>
+    </w:lvl>
+    <w:lvl w:ilvl="4" w:tentative="1">
+      <w:start w:val="1"/>
+      <w:numFmt w:val="bullet"/>
+      <w:lvlText w:val=""/>
+      <w:lvlJc w:val="left"/>
+      <w:pPr>
+        <w:tabs>
+          <w:tab w:val="num" w:pos="3600"/>
+        </w:tabs>
+        <w:ind w:left="3600" w:hanging="360"/>
+      </w:pPr>
+      <w:rPr>
+        <w:rFonts w:ascii="Wingdings" w:hAnsi="Wingdings" w:hint="default"/>
+        <w:sz w:val="20"/>
+      </w:rPr>
+    </w:lvl>
+    <w:lvl w:ilvl="5" w:tentative="1">
+      <w:start w:val="1"/>
+      <w:numFmt w:val="bullet"/>
+      <w:lvlText w:val=""/>
+      <w:lvlJc w:val="left"/>
+      <w:pPr>
+        <w:tabs>
+          <w:tab w:val="num" w:pos="4320"/>
+        </w:tabs>
+        <w:ind w:left="4320" w:hanging="360"/>
+      </w:pPr>
+      <w:rPr>
+        <w:rFonts w:ascii="Wingdings" w:hAnsi="Wingdings" w:hint="default"/>
+        <w:sz w:val="20"/>
+      </w:rPr>
+    </w:lvl>
+    <w:lvl w:ilvl="6" w:tentative="1">
+      <w:start w:val="1"/>
+      <w:numFmt w:val="bullet"/>
+      <w:lvlText w:val=""/>
+      <w:lvlJc w:val="left"/>
+      <w:pPr>
+        <w:tabs>
+          <w:tab w:val="num" w:pos="5040"/>
+        </w:tabs>
+        <w:ind w:left="5040" w:hanging="360"/>
+      </w:pPr>
+      <w:rPr>
+        <w:rFonts w:ascii="Wingdings" w:hAnsi="Wingdings" w:hint="default"/>
+        <w:sz w:val="20"/>
+      </w:rPr>
+    </w:lvl>
+    <w:lvl w:ilvl="7" w:tentative="1">
+      <w:start w:val="1"/>
+      <w:numFmt w:val="bullet"/>
+      <w:lvlText w:val=""/>
+      <w:lvlJc w:val="left"/>
+      <w:pPr>
+        <w:tabs>
+          <w:tab w:val="num" w:pos="5760"/>
+        </w:tabs>
+        <w:ind w:left="5760" w:hanging="360"/>
+      </w:pPr>
+      <w:rPr>
+        <w:rFonts w:ascii="Wingdings" w:hAnsi="Wingdings" w:hint="default"/>
+        <w:sz w:val="20"/>
+      </w:rPr>
+    </w:lvl>
+    <w:lvl w:ilvl="8" w:tentative="1">
+      <w:start w:val="1"/>
+      <w:numFmt w:val="bullet"/>
+      <w:lvlText w:val=""/>
+      <w:lvlJc w:val="left"/>
+      <w:pPr>
+        <w:tabs>
+          <w:tab w:val="num" w:pos="6480"/>
+        </w:tabs>
+        <w:ind w:left="6480" w:hanging="360"/>
+      </w:pPr>
+      <w:rPr>
+        <w:rFonts w:ascii="Wingdings" w:hAnsi="Wingdings" w:hint="default"/>
+        <w:sz w:val="20"/>
+      </w:rPr>
     </w:lvl>
   </w:abstractNum>
   <w:num w:numId="1" w16cid:durableId="887455245">
@@ -2451,16 +5256,46 @@
     <w:abstractNumId w:val="0"/>
   </w:num>
   <w:num w:numId="3" w16cid:durableId="344023090">
+    <w:abstractNumId w:val="6"/>
+  </w:num>
+  <w:num w:numId="4" w16cid:durableId="1484203734">
     <w:abstractNumId w:val="4"/>
   </w:num>
-  <w:num w:numId="4" w16cid:durableId="1484203734">
+  <w:num w:numId="5" w16cid:durableId="1254893709">
     <w:abstractNumId w:val="3"/>
   </w:num>
-  <w:num w:numId="5" w16cid:durableId="1254893709">
+  <w:num w:numId="6" w16cid:durableId="2018195525">
+    <w:abstractNumId w:val="7"/>
+  </w:num>
+  <w:num w:numId="7" w16cid:durableId="1682318213">
+    <w:abstractNumId w:val="12"/>
+  </w:num>
+  <w:num w:numId="8" w16cid:durableId="1206989897">
+    <w:abstractNumId w:val="8"/>
+  </w:num>
+  <w:num w:numId="9" w16cid:durableId="911475560">
     <w:abstractNumId w:val="2"/>
   </w:num>
-  <w:num w:numId="6" w16cid:durableId="2018195525">
+  <w:num w:numId="10" w16cid:durableId="984892846">
+    <w:abstractNumId w:val="11"/>
+  </w:num>
+  <w:num w:numId="11" w16cid:durableId="86654270">
+    <w:abstractNumId w:val="10"/>
+  </w:num>
+  <w:num w:numId="12" w16cid:durableId="1442143671">
     <w:abstractNumId w:val="5"/>
+  </w:num>
+  <w:num w:numId="13" w16cid:durableId="1182551284">
+    <w:abstractNumId w:val="13"/>
+  </w:num>
+  <w:num w:numId="14" w16cid:durableId="43599725">
+    <w:abstractNumId w:val="14"/>
+  </w:num>
+  <w:num w:numId="15" w16cid:durableId="1235242168">
+    <w:abstractNumId w:val="9"/>
+  </w:num>
+  <w:num w:numId="16" w16cid:durableId="817915775">
+    <w:abstractNumId w:val="15"/>
   </w:num>
 </w:numbering>
 </file>

</xml_diff>